<commit_message>
Forms 2 config de operadoras
</commit_message>
<xml_diff>
--- a/Documentação_ProjetoOperadoras.docx
+++ b/Documentação_ProjetoOperadoras.docx
@@ -1,6 +1,6 @@
 
 <file path=word/document.xml><?xml version="1.0" encoding="utf-8"?>
-<w:document xmlns:wpc="http://schemas.microsoft.com/office/word/2010/wordprocessingCanvas" xmlns:cx="http://schemas.microsoft.com/office/drawing/2014/chartex" xmlns:cx1="http://schemas.microsoft.com/office/drawing/2015/9/8/chartex" xmlns:mc="http://schemas.openxmlformats.org/markup-compatibility/2006" xmlns:o="urn:schemas-microsoft-com:office:office" xmlns:r="http://schemas.openxmlformats.org/officeDocument/2006/relationships" xmlns:m="http://schemas.openxmlformats.org/officeDocument/2006/math" xmlns:v="urn:schemas-microsoft-com:vml" xmlns:wp14="http://schemas.microsoft.com/office/word/2010/wordprocessingDrawing" xmlns:wp="http://schemas.openxmlformats.org/drawingml/2006/wordprocessingDrawing" xmlns:w10="urn:schemas-microsoft-com:office:word" xmlns:w="http://schemas.openxmlformats.org/wordprocessingml/2006/main" xmlns:w14="http://schemas.microsoft.com/office/word/2010/wordml" xmlns:w15="http://schemas.microsoft.com/office/word/2012/wordml" xmlns:w16se="http://schemas.microsoft.com/office/word/2015/wordml/symex" xmlns:wpg="http://schemas.microsoft.com/office/word/2010/wordprocessingGroup" xmlns:wpi="http://schemas.microsoft.com/office/word/2010/wordprocessingInk" xmlns:wne="http://schemas.microsoft.com/office/word/2006/wordml" xmlns:wps="http://schemas.microsoft.com/office/word/2010/wordprocessingShape" mc:Ignorable="w14 w15 w16se wp14">
+<w:document xmlns:wpc="http://schemas.microsoft.com/office/word/2010/wordprocessingCanvas" xmlns:cx="http://schemas.microsoft.com/office/drawing/2014/chartex" xmlns:cx1="http://schemas.microsoft.com/office/drawing/2015/9/8/chartex" xmlns:cx2="http://schemas.microsoft.com/office/drawing/2015/10/21/chartex" xmlns:cx3="http://schemas.microsoft.com/office/drawing/2016/5/9/chartex" xmlns:cx4="http://schemas.microsoft.com/office/drawing/2016/5/10/chartex" xmlns:cx5="http://schemas.microsoft.com/office/drawing/2016/5/11/chartex" xmlns:cx6="http://schemas.microsoft.com/office/drawing/2016/5/12/chartex" xmlns:cx7="http://schemas.microsoft.com/office/drawing/2016/5/13/chartex" xmlns:cx8="http://schemas.microsoft.com/office/drawing/2016/5/14/chartex" xmlns:mc="http://schemas.openxmlformats.org/markup-compatibility/2006" xmlns:aink="http://schemas.microsoft.com/office/drawing/2016/ink" xmlns:am3d="http://schemas.microsoft.com/office/drawing/2017/model3d" xmlns:o="urn:schemas-microsoft-com:office:office" xmlns:oel="http://schemas.microsoft.com/office/2019/extlst" xmlns:r="http://schemas.openxmlformats.org/officeDocument/2006/relationships" xmlns:m="http://schemas.openxmlformats.org/officeDocument/2006/math" xmlns:v="urn:schemas-microsoft-com:vml" xmlns:wp14="http://schemas.microsoft.com/office/word/2010/wordprocessingDrawing" xmlns:wp="http://schemas.openxmlformats.org/drawingml/2006/wordprocessingDrawing" xmlns:w10="urn:schemas-microsoft-com:office:word" xmlns:w="http://schemas.openxmlformats.org/wordprocessingml/2006/main" xmlns:w14="http://schemas.microsoft.com/office/word/2010/wordml" xmlns:w15="http://schemas.microsoft.com/office/word/2012/wordml" xmlns:w16cex="http://schemas.microsoft.com/office/word/2018/wordml/cex" xmlns:w16cid="http://schemas.microsoft.com/office/word/2016/wordml/cid" xmlns:w16="http://schemas.microsoft.com/office/word/2018/wordml" xmlns:w16du="http://schemas.microsoft.com/office/word/2023/wordml/word16du" xmlns:w16sdtdh="http://schemas.microsoft.com/office/word/2020/wordml/sdtdatahash" xmlns:w16sdtfl="http://schemas.microsoft.com/office/word/2024/wordml/sdtformatlock" xmlns:w16se="http://schemas.microsoft.com/office/word/2015/wordml/symex" xmlns:wpg="http://schemas.microsoft.com/office/word/2010/wordprocessingGroup" xmlns:wpi="http://schemas.microsoft.com/office/word/2010/wordprocessingInk" xmlns:wne="http://schemas.microsoft.com/office/word/2006/wordml" xmlns:wps="http://schemas.microsoft.com/office/word/2010/wordprocessingShape" mc:Ignorable="w14 w15 w16se w16cid w16 w16cex w16sdtdh w16sdtfl w16du wp14">
   <w:body>
     <w:p>
       <w:pPr>
@@ -16,10 +16,7 @@
         <w:t xml:space="preserve"> </w:t>
       </w:r>
     </w:p>
-    <w:p>
-      <w:bookmarkStart w:id="0" w:name="_GoBack"/>
-      <w:bookmarkEnd w:id="0"/>
-    </w:p>
+    <w:p/>
     <w:p>
       <w:pPr>
         <w:pStyle w:val="ateno"/>
@@ -138,7 +135,7 @@
                     <a:blip r:embed="rId6">
                       <a:extLst>
                         <a:ext uri="{96DAC541-7B7A-43D3-8B79-37D633B846F1}">
-                          <asvg:svgBlip xmlns:asvg="http://schemas.microsoft.com/office/drawing/2016/SVG/main" xmlns:w16sdtfl="http://schemas.microsoft.com/office/word/2024/wordml/sdtformatlock" xmlns:w16sdtdh="http://schemas.microsoft.com/office/word/2020/wordml/sdtdatahash" xmlns:w16du="http://schemas.microsoft.com/office/word/2023/wordml/word16du" xmlns:w16="http://schemas.microsoft.com/office/word/2018/wordml" xmlns:w16cid="http://schemas.microsoft.com/office/word/2016/wordml/cid" xmlns:w16cex="http://schemas.microsoft.com/office/word/2018/wordml/cex" xmlns:w="http://schemas.openxmlformats.org/wordprocessingml/2006/main" xmlns:w10="urn:schemas-microsoft-com:office:word" xmlns:v="urn:schemas-microsoft-com:vml" xmlns:oel="http://schemas.microsoft.com/office/2019/extlst" xmlns:o="urn:schemas-microsoft-com:office:office" xmlns:am3d="http://schemas.microsoft.com/office/drawing/2017/model3d" xmlns:aink="http://schemas.microsoft.com/office/drawing/2016/ink" xmlns:cx8="http://schemas.microsoft.com/office/drawing/2016/5/14/chartex" xmlns:cx7="http://schemas.microsoft.com/office/drawing/2016/5/13/chartex" xmlns:cx6="http://schemas.microsoft.com/office/drawing/2016/5/12/chartex" xmlns:cx5="http://schemas.microsoft.com/office/drawing/2016/5/11/chartex" xmlns:cx4="http://schemas.microsoft.com/office/drawing/2016/5/10/chartex" xmlns:cx3="http://schemas.microsoft.com/office/drawing/2016/5/9/chartex" xmlns:cx2="http://schemas.microsoft.com/office/drawing/2015/10/21/chartex" xmlns="" r:embed="rId7"/>
+                          <asvg:svgBlip xmlns:asvg="http://schemas.microsoft.com/office/drawing/2016/SVG/main" r:embed="rId7"/>
                         </a:ext>
                       </a:extLst>
                     </a:blip>
@@ -337,7 +334,7 @@
                     <a:blip r:embed="rId6">
                       <a:extLst>
                         <a:ext uri="{96DAC541-7B7A-43D3-8B79-37D633B846F1}">
-                          <asvg:svgBlip xmlns:asvg="http://schemas.microsoft.com/office/drawing/2016/SVG/main" xmlns:w16sdtfl="http://schemas.microsoft.com/office/word/2024/wordml/sdtformatlock" xmlns:w16sdtdh="http://schemas.microsoft.com/office/word/2020/wordml/sdtdatahash" xmlns:w16du="http://schemas.microsoft.com/office/word/2023/wordml/word16du" xmlns:w16="http://schemas.microsoft.com/office/word/2018/wordml" xmlns:w16cid="http://schemas.microsoft.com/office/word/2016/wordml/cid" xmlns:w16cex="http://schemas.microsoft.com/office/word/2018/wordml/cex" xmlns:w="http://schemas.openxmlformats.org/wordprocessingml/2006/main" xmlns:w10="urn:schemas-microsoft-com:office:word" xmlns:v="urn:schemas-microsoft-com:vml" xmlns:oel="http://schemas.microsoft.com/office/2019/extlst" xmlns:o="urn:schemas-microsoft-com:office:office" xmlns:am3d="http://schemas.microsoft.com/office/drawing/2017/model3d" xmlns:aink="http://schemas.microsoft.com/office/drawing/2016/ink" xmlns:cx8="http://schemas.microsoft.com/office/drawing/2016/5/14/chartex" xmlns:cx7="http://schemas.microsoft.com/office/drawing/2016/5/13/chartex" xmlns:cx6="http://schemas.microsoft.com/office/drawing/2016/5/12/chartex" xmlns:cx5="http://schemas.microsoft.com/office/drawing/2016/5/11/chartex" xmlns:cx4="http://schemas.microsoft.com/office/drawing/2016/5/10/chartex" xmlns:cx3="http://schemas.microsoft.com/office/drawing/2016/5/9/chartex" xmlns:cx2="http://schemas.microsoft.com/office/drawing/2015/10/21/chartex" xmlns="" r:embed="rId7"/>
+                          <asvg:svgBlip xmlns:asvg="http://schemas.microsoft.com/office/drawing/2016/SVG/main" r:embed="rId7"/>
                         </a:ext>
                       </a:extLst>
                     </a:blip>
@@ -462,7 +459,7 @@
                     <a:blip r:embed="rId6">
                       <a:extLst>
                         <a:ext uri="{96DAC541-7B7A-43D3-8B79-37D633B846F1}">
-                          <asvg:svgBlip xmlns:asvg="http://schemas.microsoft.com/office/drawing/2016/SVG/main" xmlns:w16sdtfl="http://schemas.microsoft.com/office/word/2024/wordml/sdtformatlock" xmlns:w16sdtdh="http://schemas.microsoft.com/office/word/2020/wordml/sdtdatahash" xmlns:w16du="http://schemas.microsoft.com/office/word/2023/wordml/word16du" xmlns:w16="http://schemas.microsoft.com/office/word/2018/wordml" xmlns:w16cid="http://schemas.microsoft.com/office/word/2016/wordml/cid" xmlns:w16cex="http://schemas.microsoft.com/office/word/2018/wordml/cex" xmlns:w="http://schemas.openxmlformats.org/wordprocessingml/2006/main" xmlns:w10="urn:schemas-microsoft-com:office:word" xmlns:v="urn:schemas-microsoft-com:vml" xmlns:oel="http://schemas.microsoft.com/office/2019/extlst" xmlns:o="urn:schemas-microsoft-com:office:office" xmlns:am3d="http://schemas.microsoft.com/office/drawing/2017/model3d" xmlns:aink="http://schemas.microsoft.com/office/drawing/2016/ink" xmlns:cx8="http://schemas.microsoft.com/office/drawing/2016/5/14/chartex" xmlns:cx7="http://schemas.microsoft.com/office/drawing/2016/5/13/chartex" xmlns:cx6="http://schemas.microsoft.com/office/drawing/2016/5/12/chartex" xmlns:cx5="http://schemas.microsoft.com/office/drawing/2016/5/11/chartex" xmlns:cx4="http://schemas.microsoft.com/office/drawing/2016/5/10/chartex" xmlns:cx3="http://schemas.microsoft.com/office/drawing/2016/5/9/chartex" xmlns:cx2="http://schemas.microsoft.com/office/drawing/2015/10/21/chartex" xmlns="" r:embed="rId7"/>
+                          <asvg:svgBlip xmlns:asvg="http://schemas.microsoft.com/office/drawing/2016/SVG/main" r:embed="rId7"/>
                         </a:ext>
                       </a:extLst>
                     </a:blip>
@@ -594,7 +591,7 @@
                     <a:blip r:embed="rId6">
                       <a:extLst>
                         <a:ext uri="{96DAC541-7B7A-43D3-8B79-37D633B846F1}">
-                          <asvg:svgBlip xmlns:asvg="http://schemas.microsoft.com/office/drawing/2016/SVG/main" xmlns:w16sdtfl="http://schemas.microsoft.com/office/word/2024/wordml/sdtformatlock" xmlns:w16sdtdh="http://schemas.microsoft.com/office/word/2020/wordml/sdtdatahash" xmlns:w16du="http://schemas.microsoft.com/office/word/2023/wordml/word16du" xmlns:w16="http://schemas.microsoft.com/office/word/2018/wordml" xmlns:w16cid="http://schemas.microsoft.com/office/word/2016/wordml/cid" xmlns:w16cex="http://schemas.microsoft.com/office/word/2018/wordml/cex" xmlns:w="http://schemas.openxmlformats.org/wordprocessingml/2006/main" xmlns:w10="urn:schemas-microsoft-com:office:word" xmlns:v="urn:schemas-microsoft-com:vml" xmlns:oel="http://schemas.microsoft.com/office/2019/extlst" xmlns:o="urn:schemas-microsoft-com:office:office" xmlns:am3d="http://schemas.microsoft.com/office/drawing/2017/model3d" xmlns:aink="http://schemas.microsoft.com/office/drawing/2016/ink" xmlns:cx8="http://schemas.microsoft.com/office/drawing/2016/5/14/chartex" xmlns:cx7="http://schemas.microsoft.com/office/drawing/2016/5/13/chartex" xmlns:cx6="http://schemas.microsoft.com/office/drawing/2016/5/12/chartex" xmlns:cx5="http://schemas.microsoft.com/office/drawing/2016/5/11/chartex" xmlns:cx4="http://schemas.microsoft.com/office/drawing/2016/5/10/chartex" xmlns:cx3="http://schemas.microsoft.com/office/drawing/2016/5/9/chartex" xmlns:cx2="http://schemas.microsoft.com/office/drawing/2015/10/21/chartex" xmlns="" r:embed="rId7"/>
+                          <asvg:svgBlip xmlns:asvg="http://schemas.microsoft.com/office/drawing/2016/SVG/main" r:embed="rId7"/>
                         </a:ext>
                       </a:extLst>
                     </a:blip>
@@ -675,18 +672,18 @@
       <w:r>
         <w:t xml:space="preserve">Configurar </w:t>
       </w:r>
-      <w:commentRangeStart w:id="1"/>
+      <w:commentRangeStart w:id="0"/>
       <w:r>
         <w:t>o tamanho do background</w:t>
       </w:r>
-      <w:commentRangeEnd w:id="1"/>
+      <w:commentRangeEnd w:id="0"/>
       <w:r>
         <w:rPr>
           <w:rStyle w:val="Refdecomentrio"/>
           <w:sz w:val="24"/>
           <w:szCs w:val="24"/>
         </w:rPr>
-        <w:commentReference w:id="1"/>
+        <w:commentReference w:id="0"/>
       </w:r>
     </w:p>
     <w:p>
@@ -700,7 +697,7 @@
       <w:r>
         <w:t xml:space="preserve">Configurar tamanho </w:t>
       </w:r>
-      <w:commentRangeStart w:id="2"/>
+      <w:commentRangeStart w:id="1"/>
       <w:r>
         <w:t xml:space="preserve">do </w:t>
       </w:r>
@@ -710,14 +707,14 @@
       <w:r>
         <w:t xml:space="preserve"> </w:t>
       </w:r>
-      <w:commentRangeEnd w:id="2"/>
+      <w:commentRangeEnd w:id="1"/>
       <w:r>
         <w:rPr>
           <w:rStyle w:val="Refdecomentrio"/>
           <w:sz w:val="24"/>
           <w:szCs w:val="24"/>
         </w:rPr>
-        <w:commentReference w:id="2"/>
+        <w:commentReference w:id="1"/>
       </w:r>
       <w:r>
         <w:t xml:space="preserve">para encaixar no fundo do formulário </w:t>
@@ -734,18 +731,18 @@
       <w:r>
         <w:t xml:space="preserve">Inserir </w:t>
       </w:r>
-      <w:commentRangeStart w:id="3"/>
+      <w:commentRangeStart w:id="2"/>
       <w:r>
         <w:t xml:space="preserve">background </w:t>
       </w:r>
-      <w:commentRangeEnd w:id="3"/>
+      <w:commentRangeEnd w:id="2"/>
       <w:r>
         <w:rPr>
           <w:rStyle w:val="Refdecomentrio"/>
           <w:sz w:val="24"/>
           <w:szCs w:val="24"/>
         </w:rPr>
-        <w:commentReference w:id="3"/>
+        <w:commentReference w:id="2"/>
       </w:r>
     </w:p>
     <w:p>
@@ -757,13 +754,8 @@
         </w:numPr>
       </w:pPr>
       <w:r>
-        <w:t xml:space="preserve">Remover transparência do </w:t>
-      </w:r>
-      <w:proofErr w:type="spellStart"/>
-      <w:r>
-        <w:t>grupobox</w:t>
-      </w:r>
-      <w:proofErr w:type="spellEnd"/>
+        <w:t>Remover transparência do grupobox</w:t>
+      </w:r>
     </w:p>
     <w:p>
       <w:pPr>
@@ -776,18 +768,18 @@
       <w:r>
         <w:t xml:space="preserve">Inserir </w:t>
       </w:r>
-      <w:commentRangeStart w:id="4"/>
+      <w:commentRangeStart w:id="3"/>
       <w:r>
         <w:t xml:space="preserve">imagem fixa </w:t>
       </w:r>
-      <w:commentRangeEnd w:id="4"/>
+      <w:commentRangeEnd w:id="3"/>
       <w:r>
         <w:rPr>
           <w:rStyle w:val="Refdecomentrio"/>
           <w:sz w:val="24"/>
           <w:szCs w:val="24"/>
         </w:rPr>
-        <w:commentReference w:id="4"/>
+        <w:commentReference w:id="3"/>
       </w:r>
     </w:p>
     <w:p>
@@ -801,21 +793,21 @@
       <w:r>
         <w:t xml:space="preserve">Editar </w:t>
       </w:r>
-      <w:commentRangeStart w:id="5"/>
+      <w:commentRangeStart w:id="4"/>
       <w:r>
         <w:t xml:space="preserve">o </w:t>
       </w:r>
       <w:r>
         <w:t>comboBox1</w:t>
       </w:r>
-      <w:commentRangeEnd w:id="5"/>
+      <w:commentRangeEnd w:id="4"/>
       <w:r>
         <w:rPr>
           <w:rStyle w:val="Refdecomentrio"/>
           <w:sz w:val="24"/>
           <w:szCs w:val="24"/>
         </w:rPr>
-        <w:commentReference w:id="5"/>
+        <w:commentReference w:id="4"/>
       </w:r>
     </w:p>
     <w:p>
@@ -829,18 +821,18 @@
       <w:r>
         <w:t xml:space="preserve">Alterar para </w:t>
       </w:r>
-      <w:commentRangeStart w:id="6"/>
+      <w:commentRangeStart w:id="5"/>
       <w:r>
         <w:t>propriedades de Lista</w:t>
       </w:r>
-      <w:commentRangeEnd w:id="6"/>
+      <w:commentRangeEnd w:id="5"/>
       <w:r>
         <w:rPr>
           <w:rStyle w:val="Refdecomentrio"/>
           <w:sz w:val="24"/>
           <w:szCs w:val="24"/>
         </w:rPr>
-        <w:commentReference w:id="6"/>
+        <w:commentReference w:id="5"/>
       </w:r>
     </w:p>
     <w:p>
@@ -854,8 +846,7 @@
       <w:r>
         <w:t xml:space="preserve">Desativar o </w:t>
       </w:r>
-      <w:commentRangeStart w:id="7"/>
-      <w:proofErr w:type="spellStart"/>
+      <w:commentRangeStart w:id="6"/>
       <w:r>
         <w:rPr>
           <w:b/>
@@ -863,7 +854,6 @@
         </w:rPr>
         <w:t>Enable</w:t>
       </w:r>
-      <w:proofErr w:type="spellEnd"/>
       <w:r>
         <w:rPr>
           <w:b/>
@@ -871,14 +861,14 @@
         </w:rPr>
         <w:t xml:space="preserve"> para o grupo</w:t>
       </w:r>
-      <w:commentRangeEnd w:id="7"/>
+      <w:commentRangeEnd w:id="6"/>
       <w:r>
         <w:rPr>
           <w:rStyle w:val="Refdecomentrio"/>
           <w:sz w:val="24"/>
           <w:szCs w:val="24"/>
         </w:rPr>
-        <w:commentReference w:id="7"/>
+        <w:commentReference w:id="6"/>
       </w:r>
     </w:p>
     <w:p>
@@ -892,23 +882,22 @@
       <w:r>
         <w:t xml:space="preserve">Remover a </w:t>
       </w:r>
-      <w:commentRangeStart w:id="8"/>
+      <w:commentRangeStart w:id="7"/>
       <w:r>
         <w:t xml:space="preserve">visibilidade dos botões </w:t>
       </w:r>
-      <w:commentRangeEnd w:id="8"/>
+      <w:commentRangeEnd w:id="7"/>
       <w:r>
         <w:rPr>
           <w:rStyle w:val="Refdecomentrio"/>
           <w:sz w:val="24"/>
           <w:szCs w:val="24"/>
         </w:rPr>
-        <w:commentReference w:id="8"/>
+        <w:commentReference w:id="7"/>
       </w:r>
       <w:r>
         <w:t xml:space="preserve">com </w:t>
       </w:r>
-      <w:proofErr w:type="spellStart"/>
       <w:r>
         <w:rPr>
           <w:b/>
@@ -916,7 +905,6 @@
         </w:rPr>
         <w:t>Visible</w:t>
       </w:r>
-      <w:proofErr w:type="spellEnd"/>
       <w:r>
         <w:rPr>
           <w:b/>
@@ -947,60 +935,36 @@
         <w:ind w:left="360" w:hanging="76"/>
       </w:pPr>
       <w:r>
-        <w:t xml:space="preserve">Configurar o envio da </w:t>
-      </w:r>
-      <w:proofErr w:type="spellStart"/>
-      <w:r>
-        <w:t>combobox</w:t>
-      </w:r>
-      <w:proofErr w:type="spellEnd"/>
-      <w:r>
-        <w:t xml:space="preserve">, para caixa de texto. Essa configuração deve seguir algumas regras. O </w:t>
-      </w:r>
-      <w:proofErr w:type="spellStart"/>
-      <w:r>
-        <w:t>combobox</w:t>
-      </w:r>
-      <w:proofErr w:type="spellEnd"/>
-      <w:r>
-        <w:t xml:space="preserve"> deve </w:t>
-      </w:r>
-      <w:proofErr w:type="spellStart"/>
-      <w:r>
-        <w:t>está</w:t>
-      </w:r>
-      <w:proofErr w:type="spellEnd"/>
-      <w:r>
-        <w:t xml:space="preserve"> </w:t>
-      </w:r>
-      <w:commentRangeStart w:id="9"/>
+        <w:t xml:space="preserve">Configurar o envio da combobox, para caixa de texto. Essa configuração deve seguir algumas regras. O combobox deve está </w:t>
+      </w:r>
+      <w:commentRangeStart w:id="8"/>
       <w:r>
         <w:t>configurado como lista</w:t>
       </w:r>
-      <w:commentRangeEnd w:id="9"/>
+      <w:commentRangeEnd w:id="8"/>
       <w:r>
         <w:rPr>
           <w:rStyle w:val="Refdecomentrio"/>
           <w:sz w:val="24"/>
           <w:szCs w:val="24"/>
         </w:rPr>
-        <w:commentReference w:id="9"/>
+        <w:commentReference w:id="8"/>
       </w:r>
       <w:r>
         <w:t xml:space="preserve">. E a ação é configurada a </w:t>
       </w:r>
-      <w:commentRangeStart w:id="10"/>
+      <w:commentRangeStart w:id="9"/>
       <w:r>
         <w:t xml:space="preserve">partir de escolher </w:t>
       </w:r>
-      <w:commentRangeEnd w:id="10"/>
+      <w:commentRangeEnd w:id="9"/>
       <w:r>
         <w:rPr>
           <w:rStyle w:val="Refdecomentrio"/>
           <w:sz w:val="24"/>
           <w:szCs w:val="24"/>
         </w:rPr>
-        <w:commentReference w:id="10"/>
+        <w:commentReference w:id="9"/>
       </w:r>
       <w:r>
         <w:t>o texto e não em click</w:t>
@@ -1022,33 +986,68 @@
         <w:rPr>
           <w:b/>
         </w:rPr>
-        <w:t>“</w:t>
-      </w:r>
-      <w:proofErr w:type="spellStart"/>
+        <w:t>“Enable”</w:t>
+      </w:r>
       <w:r>
         <w:rPr>
           <w:b/>
         </w:rPr>
-        <w:t>Enable</w:t>
-      </w:r>
-      <w:proofErr w:type="spellEnd"/>
+        <w:t xml:space="preserve"> – False. </w:t>
+      </w:r>
+      <w:r>
+        <w:t xml:space="preserve">Para que não seja possível digitar depois de receber o </w:t>
+      </w:r>
+      <w:r>
+        <w:t>texto</w:t>
+      </w:r>
+    </w:p>
+    <w:p>
+      <w:pPr>
+        <w:pStyle w:val="PargrafodaLista"/>
+        <w:numPr>
+          <w:ilvl w:val="0"/>
+          <w:numId w:val="13"/>
+        </w:numPr>
+        <w:ind w:left="360" w:hanging="76"/>
+      </w:pPr>
+      <w:r>
+        <w:t>Criar o botão confirmar com as config de abrir tela02, fechar tela 01.</w:t>
+      </w:r>
+    </w:p>
+    <w:p>
+      <w:pPr>
+        <w:pStyle w:val="PargrafodaLista"/>
+        <w:numPr>
+          <w:ilvl w:val="0"/>
+          <w:numId w:val="13"/>
+        </w:numPr>
+        <w:ind w:left="360" w:hanging="76"/>
+      </w:pPr>
+      <w:r>
+        <w:t xml:space="preserve">Liberar os objetos do formulário </w:t>
+      </w:r>
+      <w:r>
+        <w:t xml:space="preserve">do formulário 02 para ser visualizado no formulário 01. Deve-se clicar e, todos os ícones e liberar o </w:t>
+      </w:r>
       <w:r>
         <w:rPr>
           <w:b/>
-        </w:rPr>
-        <w:t>”</w:t>
+          <w:bCs/>
+        </w:rPr>
+        <w:t>Modifiers</w:t>
+      </w:r>
+      <w:r>
+        <w:t xml:space="preserve">: O modificador está definido como </w:t>
       </w:r>
       <w:r>
         <w:rPr>
           <w:b/>
-        </w:rPr>
-        <w:t xml:space="preserve"> – False. </w:t>
-      </w:r>
-      <w:r>
-        <w:t xml:space="preserve">Para que não seja possível digitar depois de receber o </w:t>
-      </w:r>
-      <w:r>
-        <w:t>texto</w:t>
+          <w:bCs/>
+        </w:rPr>
+        <w:t>Public</w:t>
+      </w:r>
+      <w:r>
+        <w:t>.</w:t>
       </w:r>
     </w:p>
     <w:p>
@@ -1090,6 +1089,386 @@
         <w:t>Explicações detalhadas</w:t>
       </w:r>
     </w:p>
+    <w:p/>
+    <w:p/>
+    <w:p>
+      <w:pPr>
+        <w:pStyle w:val="ateno"/>
+      </w:pPr>
+      <w:r>
+        <w:t>Botões</w:t>
+      </w:r>
+    </w:p>
+    <w:p>
+      <w:pPr>
+        <w:rPr>
+          <w:b/>
+          <w:bCs/>
+        </w:rPr>
+      </w:pPr>
+      <w:r>
+        <w:rPr>
+          <w:b/>
+          <w:bCs/>
+        </w:rPr>
+        <w:t>01</w:t>
+      </w:r>
+    </w:p>
+    <w:p>
+      <w:pPr>
+        <w:rPr>
+          <w:b/>
+          <w:bCs/>
+        </w:rPr>
+      </w:pPr>
+      <w:r>
+        <w:rPr>
+          <w:b/>
+          <w:bCs/>
+        </w:rPr>
+        <w:t>Mudar texto de um botão</w:t>
+      </w:r>
+    </w:p>
+    <w:p>
+      <w:r>
+        <w:t>Você altera o rótulo exibido no botão.</w:t>
+      </w:r>
+    </w:p>
+    <w:p>
+      <w:pPr>
+        <w:numPr>
+          <w:ilvl w:val="0"/>
+          <w:numId w:val="16"/>
+        </w:numPr>
+      </w:pPr>
+      <w:r>
+        <w:t>Identifique o botão: Btn_Recarga01</w:t>
+      </w:r>
+    </w:p>
+    <w:p>
+      <w:pPr>
+        <w:numPr>
+          <w:ilvl w:val="0"/>
+          <w:numId w:val="16"/>
+        </w:numPr>
+      </w:pPr>
+      <w:r>
+        <w:lastRenderedPageBreak/>
+        <w:t>Chame a propriedade: Text</w:t>
+      </w:r>
+    </w:p>
+    <w:p>
+      <w:pPr>
+        <w:numPr>
+          <w:ilvl w:val="0"/>
+          <w:numId w:val="16"/>
+        </w:numPr>
+      </w:pPr>
+      <w:r>
+        <w:t>Atribua o valor: Btn_Recarga01.Text = "Recarga";</w:t>
+      </w:r>
+    </w:p>
+    <w:p>
+      <w:pPr>
+        <w:rPr>
+          <w:b/>
+          <w:bCs/>
+        </w:rPr>
+      </w:pPr>
+      <w:r>
+        <w:rPr>
+          <w:b/>
+          <w:bCs/>
+        </w:rPr>
+        <w:t>02</w:t>
+      </w:r>
+    </w:p>
+    <w:p>
+      <w:pPr>
+        <w:rPr>
+          <w:b/>
+          <w:bCs/>
+        </w:rPr>
+      </w:pPr>
+      <w:r>
+        <w:rPr>
+          <w:b/>
+          <w:bCs/>
+        </w:rPr>
+        <w:t>Mudar fundo do botão</w:t>
+      </w:r>
+    </w:p>
+    <w:p>
+      <w:r>
+        <w:t>Você define uma imagem como fundo do botão.</w:t>
+      </w:r>
+    </w:p>
+    <w:p>
+      <w:pPr>
+        <w:numPr>
+          <w:ilvl w:val="0"/>
+          <w:numId w:val="17"/>
+        </w:numPr>
+      </w:pPr>
+      <w:r>
+        <w:t>Identifique o botão: Btn_Recarga01</w:t>
+      </w:r>
+    </w:p>
+    <w:p>
+      <w:pPr>
+        <w:numPr>
+          <w:ilvl w:val="0"/>
+          <w:numId w:val="17"/>
+        </w:numPr>
+      </w:pPr>
+      <w:r>
+        <w:t>Chame a propriedade: BackgroundImage</w:t>
+      </w:r>
+    </w:p>
+    <w:p>
+      <w:pPr>
+        <w:numPr>
+          <w:ilvl w:val="0"/>
+          <w:numId w:val="17"/>
+        </w:numPr>
+      </w:pPr>
+      <w:r>
+        <w:t>Atribua o valor: Btn_Recarga01.BackgroundImage = Image.FromFile("caminho\imagem.png");</w:t>
+      </w:r>
+    </w:p>
+    <w:p>
+      <w:pPr>
+        <w:numPr>
+          <w:ilvl w:val="0"/>
+          <w:numId w:val="17"/>
+        </w:numPr>
+        <w:rPr>
+          <w:lang w:val="en-US"/>
+        </w:rPr>
+      </w:pPr>
+      <w:r>
+        <w:rPr>
+          <w:lang w:val="en-US"/>
+        </w:rPr>
+        <w:t>Ajuste layout: Btn_Recarga01.BackgroundImageLayout = ImageLayout.Stretch;</w:t>
+      </w:r>
+    </w:p>
+    <w:p>
+      <w:pPr>
+        <w:rPr>
+          <w:b/>
+          <w:bCs/>
+        </w:rPr>
+      </w:pPr>
+      <w:r>
+        <w:rPr>
+          <w:b/>
+          <w:bCs/>
+        </w:rPr>
+        <w:t>03</w:t>
+      </w:r>
+    </w:p>
+    <w:p>
+      <w:pPr>
+        <w:rPr>
+          <w:b/>
+          <w:bCs/>
+        </w:rPr>
+      </w:pPr>
+      <w:r>
+        <w:rPr>
+          <w:b/>
+          <w:bCs/>
+        </w:rPr>
+        <w:t>Adicionar ícone ao botão</w:t>
+      </w:r>
+    </w:p>
+    <w:p>
+      <w:r>
+        <w:t>Você coloca uma imagem dentro do botão junto ao texto.</w:t>
+      </w:r>
+    </w:p>
+    <w:p>
+      <w:pPr>
+        <w:numPr>
+          <w:ilvl w:val="0"/>
+          <w:numId w:val="18"/>
+        </w:numPr>
+      </w:pPr>
+      <w:r>
+        <w:t>Identifique o botão: Btn_Recarga01</w:t>
+      </w:r>
+    </w:p>
+    <w:p>
+      <w:pPr>
+        <w:numPr>
+          <w:ilvl w:val="0"/>
+          <w:numId w:val="18"/>
+        </w:numPr>
+      </w:pPr>
+      <w:r>
+        <w:t>Chame a propriedade: Image</w:t>
+      </w:r>
+    </w:p>
+    <w:p>
+      <w:pPr>
+        <w:numPr>
+          <w:ilvl w:val="0"/>
+          <w:numId w:val="18"/>
+        </w:numPr>
+      </w:pPr>
+      <w:r>
+        <w:t>Atribua o valor: Btn_Recarga01.Image = Image.FromFile("caminho\icone.png");</w:t>
+      </w:r>
+    </w:p>
+    <w:p>
+      <w:pPr>
+        <w:numPr>
+          <w:ilvl w:val="0"/>
+          <w:numId w:val="18"/>
+        </w:numPr>
+      </w:pPr>
+      <w:r>
+        <w:t>Ajuste alinhamento: Btn_Recarga01.ImageAlign = ContentAlignment.MiddleLeft;</w:t>
+      </w:r>
+    </w:p>
+    <w:p>
+      <w:pPr>
+        <w:rPr>
+          <w:b/>
+          <w:bCs/>
+        </w:rPr>
+      </w:pPr>
+      <w:r>
+        <w:rPr>
+          <w:b/>
+          <w:bCs/>
+        </w:rPr>
+        <w:t>04</w:t>
+      </w:r>
+    </w:p>
+    <w:p>
+      <w:pPr>
+        <w:rPr>
+          <w:b/>
+          <w:bCs/>
+        </w:rPr>
+      </w:pPr>
+      <w:r>
+        <w:rPr>
+          <w:b/>
+          <w:bCs/>
+        </w:rPr>
+        <w:t>Esconder ou mostrar formulário</w:t>
+      </w:r>
+    </w:p>
+    <w:p>
+      <w:r>
+        <w:t>Você controla a visibilidade do formulário.</w:t>
+      </w:r>
+    </w:p>
+    <w:p>
+      <w:pPr>
+        <w:numPr>
+          <w:ilvl w:val="0"/>
+          <w:numId w:val="19"/>
+        </w:numPr>
+      </w:pPr>
+      <w:r>
+        <w:t>Para esconder: this.Hide();</w:t>
+      </w:r>
+    </w:p>
+    <w:p>
+      <w:pPr>
+        <w:numPr>
+          <w:ilvl w:val="0"/>
+          <w:numId w:val="19"/>
+        </w:numPr>
+      </w:pPr>
+      <w:r>
+        <w:t>Para mostrar novamente: this.Show();</w:t>
+      </w:r>
+    </w:p>
+    <w:p>
+      <w:pPr>
+        <w:numPr>
+          <w:ilvl w:val="0"/>
+          <w:numId w:val="19"/>
+        </w:numPr>
+      </w:pPr>
+      <w:r>
+        <w:t>Para fechar: this.Close();</w:t>
+      </w:r>
+    </w:p>
+    <w:p>
+      <w:pPr>
+        <w:rPr>
+          <w:b/>
+          <w:bCs/>
+        </w:rPr>
+      </w:pPr>
+      <w:r>
+        <w:rPr>
+          <w:b/>
+          <w:bCs/>
+        </w:rPr>
+        <w:t>05</w:t>
+      </w:r>
+    </w:p>
+    <w:p>
+      <w:pPr>
+        <w:rPr>
+          <w:b/>
+          <w:bCs/>
+        </w:rPr>
+      </w:pPr>
+      <w:r>
+        <w:rPr>
+          <w:b/>
+          <w:bCs/>
+        </w:rPr>
+        <w:t>Resetar formulário</w:t>
+      </w:r>
+    </w:p>
+    <w:p>
+      <w:r>
+        <w:t>Você limpa os campos do formulário para estado inicial.</w:t>
+      </w:r>
+    </w:p>
+    <w:p>
+      <w:pPr>
+        <w:numPr>
+          <w:ilvl w:val="0"/>
+          <w:numId w:val="20"/>
+        </w:numPr>
+      </w:pPr>
+      <w:r>
+        <w:t>Crie método ResetForm()</w:t>
+      </w:r>
+    </w:p>
+    <w:p>
+      <w:pPr>
+        <w:numPr>
+          <w:ilvl w:val="0"/>
+          <w:numId w:val="20"/>
+        </w:numPr>
+      </w:pPr>
+      <w:r>
+        <w:t>Percorra this.Controls</w:t>
+      </w:r>
+    </w:p>
+    <w:p>
+      <w:pPr>
+        <w:numPr>
+          <w:ilvl w:val="0"/>
+          <w:numId w:val="20"/>
+        </w:numPr>
+      </w:pPr>
+      <w:r>
+        <w:t>Limpe cada tipo: TextBox.Text = "", CheckBox.Checked = false, ComboBox.SelectedIndex = -1</w:t>
+      </w:r>
+    </w:p>
+    <w:p/>
     <w:sectPr>
       <w:pgSz w:w="11906" w:h="16838"/>
       <w:pgMar w:top="720" w:right="720" w:bottom="720" w:left="720" w:header="708" w:footer="708" w:gutter="0"/>
@@ -1101,8 +1480,8 @@
 </file>
 
 <file path=word/comments.xml><?xml version="1.0" encoding="utf-8"?>
-<w:comments xmlns:wpc="http://schemas.microsoft.com/office/word/2010/wordprocessingCanvas" xmlns:cx="http://schemas.microsoft.com/office/drawing/2014/chartex" xmlns:cx1="http://schemas.microsoft.com/office/drawing/2015/9/8/chartex" xmlns:mc="http://schemas.openxmlformats.org/markup-compatibility/2006" xmlns:o="urn:schemas-microsoft-com:office:office" xmlns:r="http://schemas.openxmlformats.org/officeDocument/2006/relationships" xmlns:m="http://schemas.openxmlformats.org/officeDocument/2006/math" xmlns:v="urn:schemas-microsoft-com:vml" xmlns:wp14="http://schemas.microsoft.com/office/word/2010/wordprocessingDrawing" xmlns:wp="http://schemas.openxmlformats.org/drawingml/2006/wordprocessingDrawing" xmlns:w10="urn:schemas-microsoft-com:office:word" xmlns:w="http://schemas.openxmlformats.org/wordprocessingml/2006/main" xmlns:w14="http://schemas.microsoft.com/office/word/2010/wordml" xmlns:w15="http://schemas.microsoft.com/office/word/2012/wordml" xmlns:w16se="http://schemas.microsoft.com/office/word/2015/wordml/symex" xmlns:wpg="http://schemas.microsoft.com/office/word/2010/wordprocessingGroup" xmlns:wpi="http://schemas.microsoft.com/office/word/2010/wordprocessingInk" xmlns:wne="http://schemas.microsoft.com/office/word/2006/wordml" xmlns:wps="http://schemas.microsoft.com/office/word/2010/wordprocessingShape" mc:Ignorable="w14 w15 w16se wp14">
-  <w:comment w:id="1" w:author="Aloma Barros" w:date="2026-09-11T12:43:00Z" w:initials="AB">
+<w:comments xmlns:wpc="http://schemas.microsoft.com/office/word/2010/wordprocessingCanvas" xmlns:cx="http://schemas.microsoft.com/office/drawing/2014/chartex" xmlns:cx1="http://schemas.microsoft.com/office/drawing/2015/9/8/chartex" xmlns:cx2="http://schemas.microsoft.com/office/drawing/2015/10/21/chartex" xmlns:cx3="http://schemas.microsoft.com/office/drawing/2016/5/9/chartex" xmlns:cx4="http://schemas.microsoft.com/office/drawing/2016/5/10/chartex" xmlns:cx5="http://schemas.microsoft.com/office/drawing/2016/5/11/chartex" xmlns:cx6="http://schemas.microsoft.com/office/drawing/2016/5/12/chartex" xmlns:cx7="http://schemas.microsoft.com/office/drawing/2016/5/13/chartex" xmlns:cx8="http://schemas.microsoft.com/office/drawing/2016/5/14/chartex" xmlns:mc="http://schemas.openxmlformats.org/markup-compatibility/2006" xmlns:aink="http://schemas.microsoft.com/office/drawing/2016/ink" xmlns:am3d="http://schemas.microsoft.com/office/drawing/2017/model3d" xmlns:o="urn:schemas-microsoft-com:office:office" xmlns:oel="http://schemas.microsoft.com/office/2019/extlst" xmlns:r="http://schemas.openxmlformats.org/officeDocument/2006/relationships" xmlns:m="http://schemas.openxmlformats.org/officeDocument/2006/math" xmlns:v="urn:schemas-microsoft-com:vml" xmlns:wp14="http://schemas.microsoft.com/office/word/2010/wordprocessingDrawing" xmlns:wp="http://schemas.openxmlformats.org/drawingml/2006/wordprocessingDrawing" xmlns:w10="urn:schemas-microsoft-com:office:word" xmlns:w="http://schemas.openxmlformats.org/wordprocessingml/2006/main" xmlns:w14="http://schemas.microsoft.com/office/word/2010/wordml" xmlns:w15="http://schemas.microsoft.com/office/word/2012/wordml" xmlns:w16cex="http://schemas.microsoft.com/office/word/2018/wordml/cex" xmlns:w16cid="http://schemas.microsoft.com/office/word/2016/wordml/cid" xmlns:w16="http://schemas.microsoft.com/office/word/2018/wordml" xmlns:w16du="http://schemas.microsoft.com/office/word/2023/wordml/word16du" xmlns:w16sdtdh="http://schemas.microsoft.com/office/word/2020/wordml/sdtdatahash" xmlns:w16sdtfl="http://schemas.microsoft.com/office/word/2024/wordml/sdtformatlock" xmlns:w16se="http://schemas.microsoft.com/office/word/2015/wordml/symex" xmlns:wpg="http://schemas.microsoft.com/office/word/2010/wordprocessingGroup" xmlns:wpi="http://schemas.microsoft.com/office/word/2010/wordprocessingInk" xmlns:wne="http://schemas.microsoft.com/office/word/2006/wordml" xmlns:wps="http://schemas.microsoft.com/office/word/2010/wordprocessingShape" mc:Ignorable="w14 w15 w16se w16cid w16 w16cex w16sdtdh w16sdtfl w16du wp14">
+  <w:comment w:id="0" w:author="Aloma Barros" w:date="2026-09-11T12:43:00Z" w:initials="AB">
     <w:p>
       <w:pPr>
         <w:pStyle w:val="Textodecomentrio"/>
@@ -1162,7 +1541,7 @@
       </w:r>
     </w:p>
   </w:comment>
-  <w:comment w:id="2" w:author="Aloma Barros" w:date="2026-09-11T12:46:00Z" w:initials="AB">
+  <w:comment w:id="1" w:author="Aloma Barros" w:date="2026-09-11T12:46:00Z" w:initials="AB">
     <w:p>
       <w:pPr>
         <w:pStyle w:val="Textodecomentrio"/>
@@ -1222,7 +1601,7 @@
       </w:r>
     </w:p>
   </w:comment>
-  <w:comment w:id="3" w:author="Aloma Barros" w:date="2026-09-11T12:51:00Z" w:initials="AB">
+  <w:comment w:id="2" w:author="Aloma Barros" w:date="2026-09-11T12:51:00Z" w:initials="AB">
     <w:p>
       <w:pPr>
         <w:pStyle w:val="Textodecomentrio"/>
@@ -1240,8 +1619,6 @@
         </w:rPr>
         <w:t xml:space="preserve"> </w:t>
       </w:r>
-      <w:proofErr w:type="spellStart"/>
-      <w:proofErr w:type="gramStart"/>
       <w:r>
         <w:rPr>
           <w:color w:val="0000FF"/>
@@ -1249,8 +1626,6 @@
         </w:rPr>
         <w:t>private</w:t>
       </w:r>
-      <w:proofErr w:type="spellEnd"/>
-      <w:proofErr w:type="gramEnd"/>
       <w:r>
         <w:rPr>
           <w:color w:val="000000"/>
@@ -1258,7 +1633,6 @@
         </w:rPr>
         <w:t xml:space="preserve"> </w:t>
       </w:r>
-      <w:proofErr w:type="spellStart"/>
       <w:r>
         <w:rPr>
           <w:color w:val="0000FF"/>
@@ -1266,7 +1640,6 @@
         </w:rPr>
         <w:t>void</w:t>
       </w:r>
-      <w:proofErr w:type="spellEnd"/>
       <w:r>
         <w:rPr>
           <w:color w:val="000000"/>
@@ -1274,7 +1647,6 @@
         </w:rPr>
         <w:t xml:space="preserve"> Form1_Load(</w:t>
       </w:r>
-      <w:proofErr w:type="spellStart"/>
       <w:r>
         <w:rPr>
           <w:color w:val="0000FF"/>
@@ -1282,45 +1654,64 @@
         </w:rPr>
         <w:t>object</w:t>
       </w:r>
-      <w:proofErr w:type="spellEnd"/>
       <w:r>
         <w:rPr>
           <w:color w:val="000000"/>
           <w:highlight w:val="white"/>
         </w:rPr>
-        <w:t xml:space="preserve"> </w:t>
-      </w:r>
-      <w:proofErr w:type="spellStart"/>
+        <w:t xml:space="preserve"> sender, </w:t>
+      </w:r>
+      <w:r>
+        <w:rPr>
+          <w:color w:val="2B91AF"/>
+          <w:highlight w:val="white"/>
+        </w:rPr>
+        <w:t>EventArgs</w:t>
+      </w:r>
       <w:r>
         <w:rPr>
           <w:color w:val="000000"/>
           <w:highlight w:val="white"/>
         </w:rPr>
-        <w:t>sender</w:t>
-      </w:r>
-      <w:proofErr w:type="spellEnd"/>
+        <w:t xml:space="preserve"> e)</w:t>
+      </w:r>
+    </w:p>
+    <w:p>
+      <w:pPr>
+        <w:pStyle w:val="Textodecomentrio"/>
+      </w:pPr>
       <w:r>
         <w:rPr>
           <w:color w:val="000000"/>
           <w:highlight w:val="white"/>
         </w:rPr>
-        <w:t xml:space="preserve">, </w:t>
-      </w:r>
-      <w:proofErr w:type="spellStart"/>
+        <w:t xml:space="preserve"> {</w:t>
+      </w:r>
+    </w:p>
+    <w:p>
+      <w:pPr>
+        <w:pStyle w:val="Textodecomentrio"/>
+      </w:pPr>
+      <w:r>
+        <w:rPr>
+          <w:color w:val="000000"/>
+          <w:highlight w:val="white"/>
+        </w:rPr>
+        <w:t xml:space="preserve">     BackgroundImage = Properties.</w:t>
+      </w:r>
       <w:r>
         <w:rPr>
           <w:color w:val="2B91AF"/>
           <w:highlight w:val="white"/>
         </w:rPr>
-        <w:t>EventArgs</w:t>
-      </w:r>
-      <w:proofErr w:type="spellEnd"/>
+        <w:t>Resources</w:t>
+      </w:r>
       <w:r>
         <w:rPr>
           <w:color w:val="000000"/>
           <w:highlight w:val="white"/>
         </w:rPr>
-        <w:t xml:space="preserve"> e)</w:t>
+        <w:t>.tema01;</w:t>
       </w:r>
     </w:p>
     <w:p>
@@ -1332,120 +1723,25 @@
           <w:color w:val="000000"/>
           <w:highlight w:val="white"/>
         </w:rPr>
-        <w:t xml:space="preserve"> {</w:t>
-      </w:r>
-    </w:p>
-    <w:p>
-      <w:pPr>
-        <w:pStyle w:val="Textodecomentrio"/>
-      </w:pPr>
+        <w:t xml:space="preserve">     BackgroundImageLayout = </w:t>
+      </w:r>
+      <w:r>
+        <w:rPr>
+          <w:color w:val="2B91AF"/>
+          <w:highlight w:val="white"/>
+        </w:rPr>
+        <w:t>ImageLayout</w:t>
+      </w:r>
       <w:r>
         <w:rPr>
           <w:color w:val="000000"/>
           <w:highlight w:val="white"/>
         </w:rPr>
-        <w:t xml:space="preserve">     </w:t>
-      </w:r>
-      <w:proofErr w:type="spellStart"/>
-      <w:r>
-        <w:rPr>
-          <w:color w:val="000000"/>
-          <w:highlight w:val="white"/>
-        </w:rPr>
-        <w:t>BackgroundImage</w:t>
-      </w:r>
-      <w:proofErr w:type="spellEnd"/>
-      <w:r>
-        <w:rPr>
-          <w:color w:val="000000"/>
-          <w:highlight w:val="white"/>
-        </w:rPr>
-        <w:t xml:space="preserve"> = </w:t>
-      </w:r>
-      <w:proofErr w:type="gramStart"/>
-      <w:r>
-        <w:rPr>
-          <w:color w:val="000000"/>
-          <w:highlight w:val="white"/>
-        </w:rPr>
-        <w:t>Properties.</w:t>
-      </w:r>
-      <w:r>
-        <w:rPr>
-          <w:color w:val="2B91AF"/>
-          <w:highlight w:val="white"/>
-        </w:rPr>
-        <w:t>Resources</w:t>
-      </w:r>
-      <w:r>
-        <w:rPr>
-          <w:color w:val="000000"/>
-          <w:highlight w:val="white"/>
-        </w:rPr>
-        <w:t>.tema</w:t>
-      </w:r>
-      <w:proofErr w:type="gramEnd"/>
-      <w:r>
-        <w:rPr>
-          <w:color w:val="000000"/>
-          <w:highlight w:val="white"/>
-        </w:rPr>
-        <w:t>01;</w:t>
-      </w:r>
-    </w:p>
-    <w:p>
-      <w:pPr>
-        <w:pStyle w:val="Textodecomentrio"/>
-      </w:pPr>
-      <w:r>
-        <w:rPr>
-          <w:color w:val="000000"/>
-          <w:highlight w:val="white"/>
-        </w:rPr>
-        <w:t xml:space="preserve">     </w:t>
-      </w:r>
-      <w:proofErr w:type="spellStart"/>
-      <w:r>
-        <w:rPr>
-          <w:color w:val="000000"/>
-          <w:highlight w:val="white"/>
-        </w:rPr>
-        <w:t>BackgroundImageLayout</w:t>
-      </w:r>
-      <w:proofErr w:type="spellEnd"/>
-      <w:r>
-        <w:rPr>
-          <w:color w:val="000000"/>
-          <w:highlight w:val="white"/>
-        </w:rPr>
-        <w:t xml:space="preserve"> = </w:t>
-      </w:r>
-      <w:proofErr w:type="spellStart"/>
-      <w:r>
-        <w:rPr>
-          <w:color w:val="2B91AF"/>
-          <w:highlight w:val="white"/>
-        </w:rPr>
-        <w:t>ImageLayout</w:t>
-      </w:r>
-      <w:r>
-        <w:rPr>
-          <w:color w:val="000000"/>
-          <w:highlight w:val="white"/>
-        </w:rPr>
-        <w:t>.Stretch</w:t>
-      </w:r>
-      <w:proofErr w:type="spellEnd"/>
-      <w:r>
-        <w:rPr>
-          <w:color w:val="000000"/>
-          <w:highlight w:val="white"/>
-        </w:rPr>
-        <w:t>;</w:t>
+        <w:t>.Stretch;</w:t>
       </w:r>
     </w:p>
   </w:comment>
-  <w:comment w:id="4" w:author="Aloma Barros" w:date="2026-09-11T13:14:00Z" w:initials="AB">
+  <w:comment w:id="3" w:author="Aloma Barros" w:date="2026-09-11T13:14:00Z" w:initials="AB">
     <w:p>
       <w:pPr>
         <w:pStyle w:val="Textodecomentrio"/>
@@ -1505,7 +1801,7 @@
       </w:r>
     </w:p>
   </w:comment>
-  <w:comment w:id="5" w:author="Aloma Barros" w:date="2026-09-11T13:14:00Z" w:initials="AB">
+  <w:comment w:id="4" w:author="Aloma Barros" w:date="2026-09-11T13:14:00Z" w:initials="AB">
     <w:p>
       <w:pPr>
         <w:pStyle w:val="Textodecomentrio"/>
@@ -1565,7 +1861,7 @@
       </w:r>
     </w:p>
   </w:comment>
-  <w:comment w:id="6" w:author="Aloma Barros" w:date="2026-09-11T13:33:00Z" w:initials="AB">
+  <w:comment w:id="5" w:author="Aloma Barros" w:date="2026-09-11T13:33:00Z" w:initials="AB">
     <w:p>
       <w:pPr>
         <w:pStyle w:val="Textodecomentrio"/>
@@ -1625,7 +1921,7 @@
       </w:r>
     </w:p>
   </w:comment>
-  <w:comment w:id="7" w:author="Aloma Barros" w:date="2026-09-11T13:24:00Z" w:initials="AB">
+  <w:comment w:id="6" w:author="Aloma Barros" w:date="2026-09-11T13:24:00Z" w:initials="AB">
     <w:p>
       <w:pPr>
         <w:pStyle w:val="Textodecomentrio"/>
@@ -1685,7 +1981,7 @@
       </w:r>
     </w:p>
   </w:comment>
-  <w:comment w:id="8" w:author="Aloma Barros" w:date="2026-09-11T13:24:00Z" w:initials="AB">
+  <w:comment w:id="7" w:author="Aloma Barros" w:date="2026-09-11T13:24:00Z" w:initials="AB">
     <w:p>
       <w:pPr>
         <w:pStyle w:val="Textodecomentrio"/>
@@ -1745,7 +2041,7 @@
       </w:r>
     </w:p>
   </w:comment>
-  <w:comment w:id="9" w:author="Aloma Barros" w:date="2026-09-11T13:41:00Z" w:initials="AB">
+  <w:comment w:id="8" w:author="Aloma Barros" w:date="2026-09-11T13:41:00Z" w:initials="AB">
     <w:p>
       <w:pPr>
         <w:pStyle w:val="Textodecomentrio"/>
@@ -1805,7 +2101,7 @@
       </w:r>
     </w:p>
   </w:comment>
-  <w:comment w:id="10" w:author="Aloma Barros" w:date="2026-09-11T13:46:00Z" w:initials="AB">
+  <w:comment w:id="9" w:author="Aloma Barros" w:date="2026-09-11T13:46:00Z" w:initials="AB">
     <w:p>
       <w:pPr>
         <w:pStyle w:val="Textodecomentrio"/>
@@ -1869,7 +2165,7 @@
 </file>
 
 <file path=word/commentsExtended.xml><?xml version="1.0" encoding="utf-8"?>
-<w15:commentsEx xmlns:wpc="http://schemas.microsoft.com/office/word/2010/wordprocessingCanvas" xmlns:cx="http://schemas.microsoft.com/office/drawing/2014/chartex" xmlns:cx1="http://schemas.microsoft.com/office/drawing/2015/9/8/chartex" xmlns:mc="http://schemas.openxmlformats.org/markup-compatibility/2006" xmlns:o="urn:schemas-microsoft-com:office:office" xmlns:r="http://schemas.openxmlformats.org/officeDocument/2006/relationships" xmlns:m="http://schemas.openxmlformats.org/officeDocument/2006/math" xmlns:v="urn:schemas-microsoft-com:vml" xmlns:wp14="http://schemas.microsoft.com/office/word/2010/wordprocessingDrawing" xmlns:wp="http://schemas.openxmlformats.org/drawingml/2006/wordprocessingDrawing" xmlns:w10="urn:schemas-microsoft-com:office:word" xmlns:w="http://schemas.openxmlformats.org/wordprocessingml/2006/main" xmlns:w14="http://schemas.microsoft.com/office/word/2010/wordml" xmlns:w15="http://schemas.microsoft.com/office/word/2012/wordml" xmlns:w16se="http://schemas.microsoft.com/office/word/2015/wordml/symex" xmlns:wpg="http://schemas.microsoft.com/office/word/2010/wordprocessingGroup" xmlns:wpi="http://schemas.microsoft.com/office/word/2010/wordprocessingInk" xmlns:wne="http://schemas.microsoft.com/office/word/2006/wordml" xmlns:wps="http://schemas.microsoft.com/office/word/2010/wordprocessingShape" mc:Ignorable="w14 w15 w16se wp14">
+<w15:commentsEx xmlns:wpc="http://schemas.microsoft.com/office/word/2010/wordprocessingCanvas" xmlns:cx="http://schemas.microsoft.com/office/drawing/2014/chartex" xmlns:cx1="http://schemas.microsoft.com/office/drawing/2015/9/8/chartex" xmlns:cx2="http://schemas.microsoft.com/office/drawing/2015/10/21/chartex" xmlns:cx3="http://schemas.microsoft.com/office/drawing/2016/5/9/chartex" xmlns:cx4="http://schemas.microsoft.com/office/drawing/2016/5/10/chartex" xmlns:cx5="http://schemas.microsoft.com/office/drawing/2016/5/11/chartex" xmlns:cx6="http://schemas.microsoft.com/office/drawing/2016/5/12/chartex" xmlns:cx7="http://schemas.microsoft.com/office/drawing/2016/5/13/chartex" xmlns:cx8="http://schemas.microsoft.com/office/drawing/2016/5/14/chartex" xmlns:mc="http://schemas.openxmlformats.org/markup-compatibility/2006" xmlns:aink="http://schemas.microsoft.com/office/drawing/2016/ink" xmlns:am3d="http://schemas.microsoft.com/office/drawing/2017/model3d" xmlns:o="urn:schemas-microsoft-com:office:office" xmlns:oel="http://schemas.microsoft.com/office/2019/extlst" xmlns:r="http://schemas.openxmlformats.org/officeDocument/2006/relationships" xmlns:m="http://schemas.openxmlformats.org/officeDocument/2006/math" xmlns:v="urn:schemas-microsoft-com:vml" xmlns:wp14="http://schemas.microsoft.com/office/word/2010/wordprocessingDrawing" xmlns:wp="http://schemas.openxmlformats.org/drawingml/2006/wordprocessingDrawing" xmlns:w10="urn:schemas-microsoft-com:office:word" xmlns:w="http://schemas.openxmlformats.org/wordprocessingml/2006/main" xmlns:w14="http://schemas.microsoft.com/office/word/2010/wordml" xmlns:w15="http://schemas.microsoft.com/office/word/2012/wordml" xmlns:w16cex="http://schemas.microsoft.com/office/word/2018/wordml/cex" xmlns:w16cid="http://schemas.microsoft.com/office/word/2016/wordml/cid" xmlns:w16="http://schemas.microsoft.com/office/word/2018/wordml" xmlns:w16du="http://schemas.microsoft.com/office/word/2023/wordml/word16du" xmlns:w16sdtdh="http://schemas.microsoft.com/office/word/2020/wordml/sdtdatahash" xmlns:w16sdtfl="http://schemas.microsoft.com/office/word/2024/wordml/sdtformatlock" xmlns:w16se="http://schemas.microsoft.com/office/word/2015/wordml/symex" xmlns:wpg="http://schemas.microsoft.com/office/word/2010/wordprocessingGroup" xmlns:wpi="http://schemas.microsoft.com/office/word/2010/wordprocessingInk" xmlns:wne="http://schemas.microsoft.com/office/word/2006/wordml" xmlns:wps="http://schemas.microsoft.com/office/word/2010/wordprocessingShape" mc:Ignorable="w14 w15 w16se w16cid w16 w16cex w16sdtdh w16sdtfl w16du wp14">
   <w15:commentEx w15:paraId="41B93D36" w15:done="0"/>
   <w15:commentEx w15:paraId="5B95C4F0" w15:done="0"/>
   <w15:commentEx w15:paraId="085769A4" w15:done="0"/>
@@ -1914,7 +2210,7 @@
 </file>
 
 <file path=word/numbering.xml><?xml version="1.0" encoding="utf-8"?>
-<w:numbering xmlns:wpc="http://schemas.microsoft.com/office/word/2010/wordprocessingCanvas" xmlns:cx="http://schemas.microsoft.com/office/drawing/2014/chartex" xmlns:cx1="http://schemas.microsoft.com/office/drawing/2015/9/8/chartex" xmlns:mc="http://schemas.openxmlformats.org/markup-compatibility/2006" xmlns:o="urn:schemas-microsoft-com:office:office" xmlns:r="http://schemas.openxmlformats.org/officeDocument/2006/relationships" xmlns:m="http://schemas.openxmlformats.org/officeDocument/2006/math" xmlns:v="urn:schemas-microsoft-com:vml" xmlns:wp14="http://schemas.microsoft.com/office/word/2010/wordprocessingDrawing" xmlns:wp="http://schemas.openxmlformats.org/drawingml/2006/wordprocessingDrawing" xmlns:w10="urn:schemas-microsoft-com:office:word" xmlns:w="http://schemas.openxmlformats.org/wordprocessingml/2006/main" xmlns:w14="http://schemas.microsoft.com/office/word/2010/wordml" xmlns:w15="http://schemas.microsoft.com/office/word/2012/wordml" xmlns:w16se="http://schemas.microsoft.com/office/word/2015/wordml/symex" xmlns:wpg="http://schemas.microsoft.com/office/word/2010/wordprocessingGroup" xmlns:wpi="http://schemas.microsoft.com/office/word/2010/wordprocessingInk" xmlns:wne="http://schemas.microsoft.com/office/word/2006/wordml" xmlns:wps="http://schemas.microsoft.com/office/word/2010/wordprocessingShape" mc:Ignorable="w14 w15 w16se wp14">
+<w:numbering xmlns:wpc="http://schemas.microsoft.com/office/word/2010/wordprocessingCanvas" xmlns:cx="http://schemas.microsoft.com/office/drawing/2014/chartex" xmlns:cx1="http://schemas.microsoft.com/office/drawing/2015/9/8/chartex" xmlns:cx2="http://schemas.microsoft.com/office/drawing/2015/10/21/chartex" xmlns:cx3="http://schemas.microsoft.com/office/drawing/2016/5/9/chartex" xmlns:cx4="http://schemas.microsoft.com/office/drawing/2016/5/10/chartex" xmlns:cx5="http://schemas.microsoft.com/office/drawing/2016/5/11/chartex" xmlns:cx6="http://schemas.microsoft.com/office/drawing/2016/5/12/chartex" xmlns:cx7="http://schemas.microsoft.com/office/drawing/2016/5/13/chartex" xmlns:cx8="http://schemas.microsoft.com/office/drawing/2016/5/14/chartex" xmlns:mc="http://schemas.openxmlformats.org/markup-compatibility/2006" xmlns:aink="http://schemas.microsoft.com/office/drawing/2016/ink" xmlns:am3d="http://schemas.microsoft.com/office/drawing/2017/model3d" xmlns:o="urn:schemas-microsoft-com:office:office" xmlns:oel="http://schemas.microsoft.com/office/2019/extlst" xmlns:r="http://schemas.openxmlformats.org/officeDocument/2006/relationships" xmlns:m="http://schemas.openxmlformats.org/officeDocument/2006/math" xmlns:v="urn:schemas-microsoft-com:vml" xmlns:wp14="http://schemas.microsoft.com/office/word/2010/wordprocessingDrawing" xmlns:wp="http://schemas.openxmlformats.org/drawingml/2006/wordprocessingDrawing" xmlns:w10="urn:schemas-microsoft-com:office:word" xmlns:w="http://schemas.openxmlformats.org/wordprocessingml/2006/main" xmlns:w14="http://schemas.microsoft.com/office/word/2010/wordml" xmlns:w15="http://schemas.microsoft.com/office/word/2012/wordml" xmlns:w16cex="http://schemas.microsoft.com/office/word/2018/wordml/cex" xmlns:w16cid="http://schemas.microsoft.com/office/word/2016/wordml/cid" xmlns:w16="http://schemas.microsoft.com/office/word/2018/wordml" xmlns:w16du="http://schemas.microsoft.com/office/word/2023/wordml/word16du" xmlns:w16sdtdh="http://schemas.microsoft.com/office/word/2020/wordml/sdtdatahash" xmlns:w16sdtfl="http://schemas.microsoft.com/office/word/2024/wordml/sdtformatlock" xmlns:w16se="http://schemas.microsoft.com/office/word/2015/wordml/symex" xmlns:wpg="http://schemas.microsoft.com/office/word/2010/wordprocessingGroup" xmlns:wpi="http://schemas.microsoft.com/office/word/2010/wordprocessingInk" xmlns:wne="http://schemas.microsoft.com/office/word/2006/wordml" xmlns:wps="http://schemas.microsoft.com/office/word/2010/wordprocessingShape" mc:Ignorable="w14 w15 w16se w16cid w16 w16cex w16sdtdh w16sdtfl w16du wp14">
   <w:abstractNum w:abstractNumId="0" w15:restartNumberingAfterBreak="0">
     <w:nsid w:val="03A57919"/>
     <w:multiLevelType w:val="multilevel"/>
@@ -2381,6 +2677,155 @@
     </w:lvl>
   </w:abstractNum>
   <w:abstractNum w:abstractNumId="4" w15:restartNumberingAfterBreak="0">
+    <w:nsid w:val="0CF544C0"/>
+    <w:multiLevelType w:val="multilevel"/>
+    <w:tmpl w:val="81760374"/>
+    <w:lvl w:ilvl="0">
+      <w:start w:val="1"/>
+      <w:numFmt w:val="bullet"/>
+      <w:lvlText w:val=""/>
+      <w:lvlJc w:val="left"/>
+      <w:pPr>
+        <w:tabs>
+          <w:tab w:val="num" w:pos="720"/>
+        </w:tabs>
+        <w:ind w:left="720" w:hanging="360"/>
+      </w:pPr>
+      <w:rPr>
+        <w:rFonts w:ascii="Symbol" w:hAnsi="Symbol" w:hint="default"/>
+        <w:sz w:val="20"/>
+      </w:rPr>
+    </w:lvl>
+    <w:lvl w:ilvl="1" w:tentative="1">
+      <w:start w:val="1"/>
+      <w:numFmt w:val="bullet"/>
+      <w:lvlText w:val="o"/>
+      <w:lvlJc w:val="left"/>
+      <w:pPr>
+        <w:tabs>
+          <w:tab w:val="num" w:pos="1440"/>
+        </w:tabs>
+        <w:ind w:left="1440" w:hanging="360"/>
+      </w:pPr>
+      <w:rPr>
+        <w:rFonts w:ascii="Courier New" w:hAnsi="Courier New" w:hint="default"/>
+        <w:sz w:val="20"/>
+      </w:rPr>
+    </w:lvl>
+    <w:lvl w:ilvl="2" w:tentative="1">
+      <w:start w:val="1"/>
+      <w:numFmt w:val="bullet"/>
+      <w:lvlText w:val=""/>
+      <w:lvlJc w:val="left"/>
+      <w:pPr>
+        <w:tabs>
+          <w:tab w:val="num" w:pos="2160"/>
+        </w:tabs>
+        <w:ind w:left="2160" w:hanging="360"/>
+      </w:pPr>
+      <w:rPr>
+        <w:rFonts w:ascii="Wingdings" w:hAnsi="Wingdings" w:hint="default"/>
+        <w:sz w:val="20"/>
+      </w:rPr>
+    </w:lvl>
+    <w:lvl w:ilvl="3" w:tentative="1">
+      <w:start w:val="1"/>
+      <w:numFmt w:val="bullet"/>
+      <w:lvlText w:val=""/>
+      <w:lvlJc w:val="left"/>
+      <w:pPr>
+        <w:tabs>
+          <w:tab w:val="num" w:pos="2880"/>
+        </w:tabs>
+        <w:ind w:left="2880" w:hanging="360"/>
+      </w:pPr>
+      <w:rPr>
+        <w:rFonts w:ascii="Wingdings" w:hAnsi="Wingdings" w:hint="default"/>
+        <w:sz w:val="20"/>
+      </w:rPr>
+    </w:lvl>
+    <w:lvl w:ilvl="4" w:tentative="1">
+      <w:start w:val="1"/>
+      <w:numFmt w:val="bullet"/>
+      <w:lvlText w:val=""/>
+      <w:lvlJc w:val="left"/>
+      <w:pPr>
+        <w:tabs>
+          <w:tab w:val="num" w:pos="3600"/>
+        </w:tabs>
+        <w:ind w:left="3600" w:hanging="360"/>
+      </w:pPr>
+      <w:rPr>
+        <w:rFonts w:ascii="Wingdings" w:hAnsi="Wingdings" w:hint="default"/>
+        <w:sz w:val="20"/>
+      </w:rPr>
+    </w:lvl>
+    <w:lvl w:ilvl="5" w:tentative="1">
+      <w:start w:val="1"/>
+      <w:numFmt w:val="bullet"/>
+      <w:lvlText w:val=""/>
+      <w:lvlJc w:val="left"/>
+      <w:pPr>
+        <w:tabs>
+          <w:tab w:val="num" w:pos="4320"/>
+        </w:tabs>
+        <w:ind w:left="4320" w:hanging="360"/>
+      </w:pPr>
+      <w:rPr>
+        <w:rFonts w:ascii="Wingdings" w:hAnsi="Wingdings" w:hint="default"/>
+        <w:sz w:val="20"/>
+      </w:rPr>
+    </w:lvl>
+    <w:lvl w:ilvl="6" w:tentative="1">
+      <w:start w:val="1"/>
+      <w:numFmt w:val="bullet"/>
+      <w:lvlText w:val=""/>
+      <w:lvlJc w:val="left"/>
+      <w:pPr>
+        <w:tabs>
+          <w:tab w:val="num" w:pos="5040"/>
+        </w:tabs>
+        <w:ind w:left="5040" w:hanging="360"/>
+      </w:pPr>
+      <w:rPr>
+        <w:rFonts w:ascii="Wingdings" w:hAnsi="Wingdings" w:hint="default"/>
+        <w:sz w:val="20"/>
+      </w:rPr>
+    </w:lvl>
+    <w:lvl w:ilvl="7" w:tentative="1">
+      <w:start w:val="1"/>
+      <w:numFmt w:val="bullet"/>
+      <w:lvlText w:val=""/>
+      <w:lvlJc w:val="left"/>
+      <w:pPr>
+        <w:tabs>
+          <w:tab w:val="num" w:pos="5760"/>
+        </w:tabs>
+        <w:ind w:left="5760" w:hanging="360"/>
+      </w:pPr>
+      <w:rPr>
+        <w:rFonts w:ascii="Wingdings" w:hAnsi="Wingdings" w:hint="default"/>
+        <w:sz w:val="20"/>
+      </w:rPr>
+    </w:lvl>
+    <w:lvl w:ilvl="8" w:tentative="1">
+      <w:start w:val="1"/>
+      <w:numFmt w:val="bullet"/>
+      <w:lvlText w:val=""/>
+      <w:lvlJc w:val="left"/>
+      <w:pPr>
+        <w:tabs>
+          <w:tab w:val="num" w:pos="6480"/>
+        </w:tabs>
+        <w:ind w:left="6480" w:hanging="360"/>
+      </w:pPr>
+      <w:rPr>
+        <w:rFonts w:ascii="Wingdings" w:hAnsi="Wingdings" w:hint="default"/>
+        <w:sz w:val="20"/>
+      </w:rPr>
+    </w:lvl>
+  </w:abstractNum>
+  <w:abstractNum w:abstractNumId="5" w15:restartNumberingAfterBreak="0">
     <w:nsid w:val="13345387"/>
     <w:multiLevelType w:val="hybridMultilevel"/>
     <w:tmpl w:val="83E08D9C"/>
@@ -2469,7 +2914,7 @@
       </w:pPr>
     </w:lvl>
   </w:abstractNum>
-  <w:abstractNum w:abstractNumId="5" w15:restartNumberingAfterBreak="0">
+  <w:abstractNum w:abstractNumId="6" w15:restartNumberingAfterBreak="0">
     <w:nsid w:val="133937C5"/>
     <w:multiLevelType w:val="hybridMultilevel"/>
     <w:tmpl w:val="DE62032C"/>
@@ -2558,7 +3003,7 @@
       </w:pPr>
     </w:lvl>
   </w:abstractNum>
-  <w:abstractNum w:abstractNumId="6" w15:restartNumberingAfterBreak="0">
+  <w:abstractNum w:abstractNumId="7" w15:restartNumberingAfterBreak="0">
     <w:nsid w:val="22013A92"/>
     <w:multiLevelType w:val="hybridMultilevel"/>
     <w:tmpl w:val="35B6EE3C"/>
@@ -2647,7 +3092,7 @@
       </w:pPr>
     </w:lvl>
   </w:abstractNum>
-  <w:abstractNum w:abstractNumId="7" w15:restartNumberingAfterBreak="0">
+  <w:abstractNum w:abstractNumId="8" w15:restartNumberingAfterBreak="0">
     <w:nsid w:val="2EBA588B"/>
     <w:multiLevelType w:val="hybridMultilevel"/>
     <w:tmpl w:val="57DACDB2"/>
@@ -2736,7 +3181,7 @@
       </w:pPr>
     </w:lvl>
   </w:abstractNum>
-  <w:abstractNum w:abstractNumId="8" w15:restartNumberingAfterBreak="0">
+  <w:abstractNum w:abstractNumId="9" w15:restartNumberingAfterBreak="0">
     <w:nsid w:val="2FDB2E1E"/>
     <w:multiLevelType w:val="hybridMultilevel"/>
     <w:tmpl w:val="3118BDF2"/>
@@ -2849,7 +3294,7 @@
       </w:rPr>
     </w:lvl>
   </w:abstractNum>
-  <w:abstractNum w:abstractNumId="9" w15:restartNumberingAfterBreak="0">
+  <w:abstractNum w:abstractNumId="10" w15:restartNumberingAfterBreak="0">
     <w:nsid w:val="33D6463C"/>
     <w:multiLevelType w:val="hybridMultilevel"/>
     <w:tmpl w:val="E6F61EE2"/>
@@ -2962,7 +3407,305 @@
       </w:rPr>
     </w:lvl>
   </w:abstractNum>
-  <w:abstractNum w:abstractNumId="10" w15:restartNumberingAfterBreak="0">
+  <w:abstractNum w:abstractNumId="11" w15:restartNumberingAfterBreak="0">
+    <w:nsid w:val="342660A3"/>
+    <w:multiLevelType w:val="multilevel"/>
+    <w:tmpl w:val="35AEAB1C"/>
+    <w:lvl w:ilvl="0">
+      <w:start w:val="1"/>
+      <w:numFmt w:val="bullet"/>
+      <w:lvlText w:val=""/>
+      <w:lvlJc w:val="left"/>
+      <w:pPr>
+        <w:tabs>
+          <w:tab w:val="num" w:pos="720"/>
+        </w:tabs>
+        <w:ind w:left="720" w:hanging="360"/>
+      </w:pPr>
+      <w:rPr>
+        <w:rFonts w:ascii="Symbol" w:hAnsi="Symbol" w:hint="default"/>
+        <w:sz w:val="20"/>
+      </w:rPr>
+    </w:lvl>
+    <w:lvl w:ilvl="1" w:tentative="1">
+      <w:start w:val="1"/>
+      <w:numFmt w:val="bullet"/>
+      <w:lvlText w:val="o"/>
+      <w:lvlJc w:val="left"/>
+      <w:pPr>
+        <w:tabs>
+          <w:tab w:val="num" w:pos="1440"/>
+        </w:tabs>
+        <w:ind w:left="1440" w:hanging="360"/>
+      </w:pPr>
+      <w:rPr>
+        <w:rFonts w:ascii="Courier New" w:hAnsi="Courier New" w:hint="default"/>
+        <w:sz w:val="20"/>
+      </w:rPr>
+    </w:lvl>
+    <w:lvl w:ilvl="2" w:tentative="1">
+      <w:start w:val="1"/>
+      <w:numFmt w:val="bullet"/>
+      <w:lvlText w:val=""/>
+      <w:lvlJc w:val="left"/>
+      <w:pPr>
+        <w:tabs>
+          <w:tab w:val="num" w:pos="2160"/>
+        </w:tabs>
+        <w:ind w:left="2160" w:hanging="360"/>
+      </w:pPr>
+      <w:rPr>
+        <w:rFonts w:ascii="Wingdings" w:hAnsi="Wingdings" w:hint="default"/>
+        <w:sz w:val="20"/>
+      </w:rPr>
+    </w:lvl>
+    <w:lvl w:ilvl="3" w:tentative="1">
+      <w:start w:val="1"/>
+      <w:numFmt w:val="bullet"/>
+      <w:lvlText w:val=""/>
+      <w:lvlJc w:val="left"/>
+      <w:pPr>
+        <w:tabs>
+          <w:tab w:val="num" w:pos="2880"/>
+        </w:tabs>
+        <w:ind w:left="2880" w:hanging="360"/>
+      </w:pPr>
+      <w:rPr>
+        <w:rFonts w:ascii="Wingdings" w:hAnsi="Wingdings" w:hint="default"/>
+        <w:sz w:val="20"/>
+      </w:rPr>
+    </w:lvl>
+    <w:lvl w:ilvl="4" w:tentative="1">
+      <w:start w:val="1"/>
+      <w:numFmt w:val="bullet"/>
+      <w:lvlText w:val=""/>
+      <w:lvlJc w:val="left"/>
+      <w:pPr>
+        <w:tabs>
+          <w:tab w:val="num" w:pos="3600"/>
+        </w:tabs>
+        <w:ind w:left="3600" w:hanging="360"/>
+      </w:pPr>
+      <w:rPr>
+        <w:rFonts w:ascii="Wingdings" w:hAnsi="Wingdings" w:hint="default"/>
+        <w:sz w:val="20"/>
+      </w:rPr>
+    </w:lvl>
+    <w:lvl w:ilvl="5" w:tentative="1">
+      <w:start w:val="1"/>
+      <w:numFmt w:val="bullet"/>
+      <w:lvlText w:val=""/>
+      <w:lvlJc w:val="left"/>
+      <w:pPr>
+        <w:tabs>
+          <w:tab w:val="num" w:pos="4320"/>
+        </w:tabs>
+        <w:ind w:left="4320" w:hanging="360"/>
+      </w:pPr>
+      <w:rPr>
+        <w:rFonts w:ascii="Wingdings" w:hAnsi="Wingdings" w:hint="default"/>
+        <w:sz w:val="20"/>
+      </w:rPr>
+    </w:lvl>
+    <w:lvl w:ilvl="6" w:tentative="1">
+      <w:start w:val="1"/>
+      <w:numFmt w:val="bullet"/>
+      <w:lvlText w:val=""/>
+      <w:lvlJc w:val="left"/>
+      <w:pPr>
+        <w:tabs>
+          <w:tab w:val="num" w:pos="5040"/>
+        </w:tabs>
+        <w:ind w:left="5040" w:hanging="360"/>
+      </w:pPr>
+      <w:rPr>
+        <w:rFonts w:ascii="Wingdings" w:hAnsi="Wingdings" w:hint="default"/>
+        <w:sz w:val="20"/>
+      </w:rPr>
+    </w:lvl>
+    <w:lvl w:ilvl="7" w:tentative="1">
+      <w:start w:val="1"/>
+      <w:numFmt w:val="bullet"/>
+      <w:lvlText w:val=""/>
+      <w:lvlJc w:val="left"/>
+      <w:pPr>
+        <w:tabs>
+          <w:tab w:val="num" w:pos="5760"/>
+        </w:tabs>
+        <w:ind w:left="5760" w:hanging="360"/>
+      </w:pPr>
+      <w:rPr>
+        <w:rFonts w:ascii="Wingdings" w:hAnsi="Wingdings" w:hint="default"/>
+        <w:sz w:val="20"/>
+      </w:rPr>
+    </w:lvl>
+    <w:lvl w:ilvl="8" w:tentative="1">
+      <w:start w:val="1"/>
+      <w:numFmt w:val="bullet"/>
+      <w:lvlText w:val=""/>
+      <w:lvlJc w:val="left"/>
+      <w:pPr>
+        <w:tabs>
+          <w:tab w:val="num" w:pos="6480"/>
+        </w:tabs>
+        <w:ind w:left="6480" w:hanging="360"/>
+      </w:pPr>
+      <w:rPr>
+        <w:rFonts w:ascii="Wingdings" w:hAnsi="Wingdings" w:hint="default"/>
+        <w:sz w:val="20"/>
+      </w:rPr>
+    </w:lvl>
+  </w:abstractNum>
+  <w:abstractNum w:abstractNumId="12" w15:restartNumberingAfterBreak="0">
+    <w:nsid w:val="3E1D2365"/>
+    <w:multiLevelType w:val="multilevel"/>
+    <w:tmpl w:val="05108320"/>
+    <w:lvl w:ilvl="0">
+      <w:start w:val="1"/>
+      <w:numFmt w:val="bullet"/>
+      <w:lvlText w:val=""/>
+      <w:lvlJc w:val="left"/>
+      <w:pPr>
+        <w:tabs>
+          <w:tab w:val="num" w:pos="720"/>
+        </w:tabs>
+        <w:ind w:left="720" w:hanging="360"/>
+      </w:pPr>
+      <w:rPr>
+        <w:rFonts w:ascii="Symbol" w:hAnsi="Symbol" w:hint="default"/>
+        <w:sz w:val="20"/>
+      </w:rPr>
+    </w:lvl>
+    <w:lvl w:ilvl="1" w:tentative="1">
+      <w:start w:val="1"/>
+      <w:numFmt w:val="bullet"/>
+      <w:lvlText w:val="o"/>
+      <w:lvlJc w:val="left"/>
+      <w:pPr>
+        <w:tabs>
+          <w:tab w:val="num" w:pos="1440"/>
+        </w:tabs>
+        <w:ind w:left="1440" w:hanging="360"/>
+      </w:pPr>
+      <w:rPr>
+        <w:rFonts w:ascii="Courier New" w:hAnsi="Courier New" w:hint="default"/>
+        <w:sz w:val="20"/>
+      </w:rPr>
+    </w:lvl>
+    <w:lvl w:ilvl="2" w:tentative="1">
+      <w:start w:val="1"/>
+      <w:numFmt w:val="bullet"/>
+      <w:lvlText w:val=""/>
+      <w:lvlJc w:val="left"/>
+      <w:pPr>
+        <w:tabs>
+          <w:tab w:val="num" w:pos="2160"/>
+        </w:tabs>
+        <w:ind w:left="2160" w:hanging="360"/>
+      </w:pPr>
+      <w:rPr>
+        <w:rFonts w:ascii="Wingdings" w:hAnsi="Wingdings" w:hint="default"/>
+        <w:sz w:val="20"/>
+      </w:rPr>
+    </w:lvl>
+    <w:lvl w:ilvl="3" w:tentative="1">
+      <w:start w:val="1"/>
+      <w:numFmt w:val="bullet"/>
+      <w:lvlText w:val=""/>
+      <w:lvlJc w:val="left"/>
+      <w:pPr>
+        <w:tabs>
+          <w:tab w:val="num" w:pos="2880"/>
+        </w:tabs>
+        <w:ind w:left="2880" w:hanging="360"/>
+      </w:pPr>
+      <w:rPr>
+        <w:rFonts w:ascii="Wingdings" w:hAnsi="Wingdings" w:hint="default"/>
+        <w:sz w:val="20"/>
+      </w:rPr>
+    </w:lvl>
+    <w:lvl w:ilvl="4" w:tentative="1">
+      <w:start w:val="1"/>
+      <w:numFmt w:val="bullet"/>
+      <w:lvlText w:val=""/>
+      <w:lvlJc w:val="left"/>
+      <w:pPr>
+        <w:tabs>
+          <w:tab w:val="num" w:pos="3600"/>
+        </w:tabs>
+        <w:ind w:left="3600" w:hanging="360"/>
+      </w:pPr>
+      <w:rPr>
+        <w:rFonts w:ascii="Wingdings" w:hAnsi="Wingdings" w:hint="default"/>
+        <w:sz w:val="20"/>
+      </w:rPr>
+    </w:lvl>
+    <w:lvl w:ilvl="5" w:tentative="1">
+      <w:start w:val="1"/>
+      <w:numFmt w:val="bullet"/>
+      <w:lvlText w:val=""/>
+      <w:lvlJc w:val="left"/>
+      <w:pPr>
+        <w:tabs>
+          <w:tab w:val="num" w:pos="4320"/>
+        </w:tabs>
+        <w:ind w:left="4320" w:hanging="360"/>
+      </w:pPr>
+      <w:rPr>
+        <w:rFonts w:ascii="Wingdings" w:hAnsi="Wingdings" w:hint="default"/>
+        <w:sz w:val="20"/>
+      </w:rPr>
+    </w:lvl>
+    <w:lvl w:ilvl="6" w:tentative="1">
+      <w:start w:val="1"/>
+      <w:numFmt w:val="bullet"/>
+      <w:lvlText w:val=""/>
+      <w:lvlJc w:val="left"/>
+      <w:pPr>
+        <w:tabs>
+          <w:tab w:val="num" w:pos="5040"/>
+        </w:tabs>
+        <w:ind w:left="5040" w:hanging="360"/>
+      </w:pPr>
+      <w:rPr>
+        <w:rFonts w:ascii="Wingdings" w:hAnsi="Wingdings" w:hint="default"/>
+        <w:sz w:val="20"/>
+      </w:rPr>
+    </w:lvl>
+    <w:lvl w:ilvl="7" w:tentative="1">
+      <w:start w:val="1"/>
+      <w:numFmt w:val="bullet"/>
+      <w:lvlText w:val=""/>
+      <w:lvlJc w:val="left"/>
+      <w:pPr>
+        <w:tabs>
+          <w:tab w:val="num" w:pos="5760"/>
+        </w:tabs>
+        <w:ind w:left="5760" w:hanging="360"/>
+      </w:pPr>
+      <w:rPr>
+        <w:rFonts w:ascii="Wingdings" w:hAnsi="Wingdings" w:hint="default"/>
+        <w:sz w:val="20"/>
+      </w:rPr>
+    </w:lvl>
+    <w:lvl w:ilvl="8" w:tentative="1">
+      <w:start w:val="1"/>
+      <w:numFmt w:val="bullet"/>
+      <w:lvlText w:val=""/>
+      <w:lvlJc w:val="left"/>
+      <w:pPr>
+        <w:tabs>
+          <w:tab w:val="num" w:pos="6480"/>
+        </w:tabs>
+        <w:ind w:left="6480" w:hanging="360"/>
+      </w:pPr>
+      <w:rPr>
+        <w:rFonts w:ascii="Wingdings" w:hAnsi="Wingdings" w:hint="default"/>
+        <w:sz w:val="20"/>
+      </w:rPr>
+    </w:lvl>
+  </w:abstractNum>
+  <w:abstractNum w:abstractNumId="13" w15:restartNumberingAfterBreak="0">
     <w:nsid w:val="415218FE"/>
     <w:multiLevelType w:val="multilevel"/>
     <w:tmpl w:val="D71CDAFA"/>
@@ -3075,7 +3818,156 @@
       </w:pPr>
     </w:lvl>
   </w:abstractNum>
-  <w:abstractNum w:abstractNumId="11" w15:restartNumberingAfterBreak="0">
+  <w:abstractNum w:abstractNumId="14" w15:restartNumberingAfterBreak="0">
+    <w:nsid w:val="42B009F8"/>
+    <w:multiLevelType w:val="multilevel"/>
+    <w:tmpl w:val="592A05BE"/>
+    <w:lvl w:ilvl="0">
+      <w:start w:val="1"/>
+      <w:numFmt w:val="bullet"/>
+      <w:lvlText w:val=""/>
+      <w:lvlJc w:val="left"/>
+      <w:pPr>
+        <w:tabs>
+          <w:tab w:val="num" w:pos="720"/>
+        </w:tabs>
+        <w:ind w:left="720" w:hanging="360"/>
+      </w:pPr>
+      <w:rPr>
+        <w:rFonts w:ascii="Symbol" w:hAnsi="Symbol" w:hint="default"/>
+        <w:sz w:val="20"/>
+      </w:rPr>
+    </w:lvl>
+    <w:lvl w:ilvl="1" w:tentative="1">
+      <w:start w:val="1"/>
+      <w:numFmt w:val="bullet"/>
+      <w:lvlText w:val="o"/>
+      <w:lvlJc w:val="left"/>
+      <w:pPr>
+        <w:tabs>
+          <w:tab w:val="num" w:pos="1440"/>
+        </w:tabs>
+        <w:ind w:left="1440" w:hanging="360"/>
+      </w:pPr>
+      <w:rPr>
+        <w:rFonts w:ascii="Courier New" w:hAnsi="Courier New" w:hint="default"/>
+        <w:sz w:val="20"/>
+      </w:rPr>
+    </w:lvl>
+    <w:lvl w:ilvl="2" w:tentative="1">
+      <w:start w:val="1"/>
+      <w:numFmt w:val="bullet"/>
+      <w:lvlText w:val=""/>
+      <w:lvlJc w:val="left"/>
+      <w:pPr>
+        <w:tabs>
+          <w:tab w:val="num" w:pos="2160"/>
+        </w:tabs>
+        <w:ind w:left="2160" w:hanging="360"/>
+      </w:pPr>
+      <w:rPr>
+        <w:rFonts w:ascii="Wingdings" w:hAnsi="Wingdings" w:hint="default"/>
+        <w:sz w:val="20"/>
+      </w:rPr>
+    </w:lvl>
+    <w:lvl w:ilvl="3" w:tentative="1">
+      <w:start w:val="1"/>
+      <w:numFmt w:val="bullet"/>
+      <w:lvlText w:val=""/>
+      <w:lvlJc w:val="left"/>
+      <w:pPr>
+        <w:tabs>
+          <w:tab w:val="num" w:pos="2880"/>
+        </w:tabs>
+        <w:ind w:left="2880" w:hanging="360"/>
+      </w:pPr>
+      <w:rPr>
+        <w:rFonts w:ascii="Wingdings" w:hAnsi="Wingdings" w:hint="default"/>
+        <w:sz w:val="20"/>
+      </w:rPr>
+    </w:lvl>
+    <w:lvl w:ilvl="4" w:tentative="1">
+      <w:start w:val="1"/>
+      <w:numFmt w:val="bullet"/>
+      <w:lvlText w:val=""/>
+      <w:lvlJc w:val="left"/>
+      <w:pPr>
+        <w:tabs>
+          <w:tab w:val="num" w:pos="3600"/>
+        </w:tabs>
+        <w:ind w:left="3600" w:hanging="360"/>
+      </w:pPr>
+      <w:rPr>
+        <w:rFonts w:ascii="Wingdings" w:hAnsi="Wingdings" w:hint="default"/>
+        <w:sz w:val="20"/>
+      </w:rPr>
+    </w:lvl>
+    <w:lvl w:ilvl="5" w:tentative="1">
+      <w:start w:val="1"/>
+      <w:numFmt w:val="bullet"/>
+      <w:lvlText w:val=""/>
+      <w:lvlJc w:val="left"/>
+      <w:pPr>
+        <w:tabs>
+          <w:tab w:val="num" w:pos="4320"/>
+        </w:tabs>
+        <w:ind w:left="4320" w:hanging="360"/>
+      </w:pPr>
+      <w:rPr>
+        <w:rFonts w:ascii="Wingdings" w:hAnsi="Wingdings" w:hint="default"/>
+        <w:sz w:val="20"/>
+      </w:rPr>
+    </w:lvl>
+    <w:lvl w:ilvl="6" w:tentative="1">
+      <w:start w:val="1"/>
+      <w:numFmt w:val="bullet"/>
+      <w:lvlText w:val=""/>
+      <w:lvlJc w:val="left"/>
+      <w:pPr>
+        <w:tabs>
+          <w:tab w:val="num" w:pos="5040"/>
+        </w:tabs>
+        <w:ind w:left="5040" w:hanging="360"/>
+      </w:pPr>
+      <w:rPr>
+        <w:rFonts w:ascii="Wingdings" w:hAnsi="Wingdings" w:hint="default"/>
+        <w:sz w:val="20"/>
+      </w:rPr>
+    </w:lvl>
+    <w:lvl w:ilvl="7" w:tentative="1">
+      <w:start w:val="1"/>
+      <w:numFmt w:val="bullet"/>
+      <w:lvlText w:val=""/>
+      <w:lvlJc w:val="left"/>
+      <w:pPr>
+        <w:tabs>
+          <w:tab w:val="num" w:pos="5760"/>
+        </w:tabs>
+        <w:ind w:left="5760" w:hanging="360"/>
+      </w:pPr>
+      <w:rPr>
+        <w:rFonts w:ascii="Wingdings" w:hAnsi="Wingdings" w:hint="default"/>
+        <w:sz w:val="20"/>
+      </w:rPr>
+    </w:lvl>
+    <w:lvl w:ilvl="8" w:tentative="1">
+      <w:start w:val="1"/>
+      <w:numFmt w:val="bullet"/>
+      <w:lvlText w:val=""/>
+      <w:lvlJc w:val="left"/>
+      <w:pPr>
+        <w:tabs>
+          <w:tab w:val="num" w:pos="6480"/>
+        </w:tabs>
+        <w:ind w:left="6480" w:hanging="360"/>
+      </w:pPr>
+      <w:rPr>
+        <w:rFonts w:ascii="Wingdings" w:hAnsi="Wingdings" w:hint="default"/>
+        <w:sz w:val="20"/>
+      </w:rPr>
+    </w:lvl>
+  </w:abstractNum>
+  <w:abstractNum w:abstractNumId="15" w15:restartNumberingAfterBreak="0">
     <w:nsid w:val="58B3158A"/>
     <w:multiLevelType w:val="multilevel"/>
     <w:tmpl w:val="2884D2E6"/>
@@ -3188,7 +4080,156 @@
       </w:pPr>
     </w:lvl>
   </w:abstractNum>
-  <w:abstractNum w:abstractNumId="12" w15:restartNumberingAfterBreak="0">
+  <w:abstractNum w:abstractNumId="16" w15:restartNumberingAfterBreak="0">
+    <w:nsid w:val="625A552E"/>
+    <w:multiLevelType w:val="multilevel"/>
+    <w:tmpl w:val="25BE4E86"/>
+    <w:lvl w:ilvl="0">
+      <w:start w:val="1"/>
+      <w:numFmt w:val="bullet"/>
+      <w:lvlText w:val=""/>
+      <w:lvlJc w:val="left"/>
+      <w:pPr>
+        <w:tabs>
+          <w:tab w:val="num" w:pos="720"/>
+        </w:tabs>
+        <w:ind w:left="720" w:hanging="360"/>
+      </w:pPr>
+      <w:rPr>
+        <w:rFonts w:ascii="Symbol" w:hAnsi="Symbol" w:hint="default"/>
+        <w:sz w:val="20"/>
+      </w:rPr>
+    </w:lvl>
+    <w:lvl w:ilvl="1" w:tentative="1">
+      <w:start w:val="1"/>
+      <w:numFmt w:val="bullet"/>
+      <w:lvlText w:val="o"/>
+      <w:lvlJc w:val="left"/>
+      <w:pPr>
+        <w:tabs>
+          <w:tab w:val="num" w:pos="1440"/>
+        </w:tabs>
+        <w:ind w:left="1440" w:hanging="360"/>
+      </w:pPr>
+      <w:rPr>
+        <w:rFonts w:ascii="Courier New" w:hAnsi="Courier New" w:hint="default"/>
+        <w:sz w:val="20"/>
+      </w:rPr>
+    </w:lvl>
+    <w:lvl w:ilvl="2" w:tentative="1">
+      <w:start w:val="1"/>
+      <w:numFmt w:val="bullet"/>
+      <w:lvlText w:val=""/>
+      <w:lvlJc w:val="left"/>
+      <w:pPr>
+        <w:tabs>
+          <w:tab w:val="num" w:pos="2160"/>
+        </w:tabs>
+        <w:ind w:left="2160" w:hanging="360"/>
+      </w:pPr>
+      <w:rPr>
+        <w:rFonts w:ascii="Wingdings" w:hAnsi="Wingdings" w:hint="default"/>
+        <w:sz w:val="20"/>
+      </w:rPr>
+    </w:lvl>
+    <w:lvl w:ilvl="3" w:tentative="1">
+      <w:start w:val="1"/>
+      <w:numFmt w:val="bullet"/>
+      <w:lvlText w:val=""/>
+      <w:lvlJc w:val="left"/>
+      <w:pPr>
+        <w:tabs>
+          <w:tab w:val="num" w:pos="2880"/>
+        </w:tabs>
+        <w:ind w:left="2880" w:hanging="360"/>
+      </w:pPr>
+      <w:rPr>
+        <w:rFonts w:ascii="Wingdings" w:hAnsi="Wingdings" w:hint="default"/>
+        <w:sz w:val="20"/>
+      </w:rPr>
+    </w:lvl>
+    <w:lvl w:ilvl="4" w:tentative="1">
+      <w:start w:val="1"/>
+      <w:numFmt w:val="bullet"/>
+      <w:lvlText w:val=""/>
+      <w:lvlJc w:val="left"/>
+      <w:pPr>
+        <w:tabs>
+          <w:tab w:val="num" w:pos="3600"/>
+        </w:tabs>
+        <w:ind w:left="3600" w:hanging="360"/>
+      </w:pPr>
+      <w:rPr>
+        <w:rFonts w:ascii="Wingdings" w:hAnsi="Wingdings" w:hint="default"/>
+        <w:sz w:val="20"/>
+      </w:rPr>
+    </w:lvl>
+    <w:lvl w:ilvl="5" w:tentative="1">
+      <w:start w:val="1"/>
+      <w:numFmt w:val="bullet"/>
+      <w:lvlText w:val=""/>
+      <w:lvlJc w:val="left"/>
+      <w:pPr>
+        <w:tabs>
+          <w:tab w:val="num" w:pos="4320"/>
+        </w:tabs>
+        <w:ind w:left="4320" w:hanging="360"/>
+      </w:pPr>
+      <w:rPr>
+        <w:rFonts w:ascii="Wingdings" w:hAnsi="Wingdings" w:hint="default"/>
+        <w:sz w:val="20"/>
+      </w:rPr>
+    </w:lvl>
+    <w:lvl w:ilvl="6" w:tentative="1">
+      <w:start w:val="1"/>
+      <w:numFmt w:val="bullet"/>
+      <w:lvlText w:val=""/>
+      <w:lvlJc w:val="left"/>
+      <w:pPr>
+        <w:tabs>
+          <w:tab w:val="num" w:pos="5040"/>
+        </w:tabs>
+        <w:ind w:left="5040" w:hanging="360"/>
+      </w:pPr>
+      <w:rPr>
+        <w:rFonts w:ascii="Wingdings" w:hAnsi="Wingdings" w:hint="default"/>
+        <w:sz w:val="20"/>
+      </w:rPr>
+    </w:lvl>
+    <w:lvl w:ilvl="7" w:tentative="1">
+      <w:start w:val="1"/>
+      <w:numFmt w:val="bullet"/>
+      <w:lvlText w:val=""/>
+      <w:lvlJc w:val="left"/>
+      <w:pPr>
+        <w:tabs>
+          <w:tab w:val="num" w:pos="5760"/>
+        </w:tabs>
+        <w:ind w:left="5760" w:hanging="360"/>
+      </w:pPr>
+      <w:rPr>
+        <w:rFonts w:ascii="Wingdings" w:hAnsi="Wingdings" w:hint="default"/>
+        <w:sz w:val="20"/>
+      </w:rPr>
+    </w:lvl>
+    <w:lvl w:ilvl="8" w:tentative="1">
+      <w:start w:val="1"/>
+      <w:numFmt w:val="bullet"/>
+      <w:lvlText w:val=""/>
+      <w:lvlJc w:val="left"/>
+      <w:pPr>
+        <w:tabs>
+          <w:tab w:val="num" w:pos="6480"/>
+        </w:tabs>
+        <w:ind w:left="6480" w:hanging="360"/>
+      </w:pPr>
+      <w:rPr>
+        <w:rFonts w:ascii="Wingdings" w:hAnsi="Wingdings" w:hint="default"/>
+        <w:sz w:val="20"/>
+      </w:rPr>
+    </w:lvl>
+  </w:abstractNum>
+  <w:abstractNum w:abstractNumId="17" w15:restartNumberingAfterBreak="0">
     <w:nsid w:val="6F433428"/>
     <w:multiLevelType w:val="hybridMultilevel"/>
     <w:tmpl w:val="FC481A7E"/>
@@ -3301,7 +4342,7 @@
       </w:rPr>
     </w:lvl>
   </w:abstractNum>
-  <w:abstractNum w:abstractNumId="13" w15:restartNumberingAfterBreak="0">
+  <w:abstractNum w:abstractNumId="18" w15:restartNumberingAfterBreak="0">
     <w:nsid w:val="72091A35"/>
     <w:multiLevelType w:val="multilevel"/>
     <w:tmpl w:val="17C07E9E"/>
@@ -3450,7 +4491,7 @@
       </w:rPr>
     </w:lvl>
   </w:abstractNum>
-  <w:abstractNum w:abstractNumId="14" w15:restartNumberingAfterBreak="0">
+  <w:abstractNum w:abstractNumId="19" w15:restartNumberingAfterBreak="0">
     <w:nsid w:val="74536FFA"/>
     <w:multiLevelType w:val="hybridMultilevel"/>
     <w:tmpl w:val="EF486798"/>
@@ -3563,56 +4604,71 @@
       </w:rPr>
     </w:lvl>
   </w:abstractNum>
-  <w:num w:numId="1">
+  <w:num w:numId="1" w16cid:durableId="1522820960">
     <w:abstractNumId w:val="2"/>
   </w:num>
-  <w:num w:numId="2">
+  <w:num w:numId="2" w16cid:durableId="999575321">
+    <w:abstractNumId w:val="18"/>
+  </w:num>
+  <w:num w:numId="3" w16cid:durableId="289021923">
     <w:abstractNumId w:val="13"/>
   </w:num>
-  <w:num w:numId="3">
+  <w:num w:numId="4" w16cid:durableId="2084329063">
+    <w:abstractNumId w:val="3"/>
+  </w:num>
+  <w:num w:numId="5" w16cid:durableId="2030713720">
+    <w:abstractNumId w:val="15"/>
+  </w:num>
+  <w:num w:numId="6" w16cid:durableId="954822880">
+    <w:abstractNumId w:val="5"/>
+  </w:num>
+  <w:num w:numId="7" w16cid:durableId="829180444">
+    <w:abstractNumId w:val="1"/>
+  </w:num>
+  <w:num w:numId="8" w16cid:durableId="1273905269">
     <w:abstractNumId w:val="10"/>
   </w:num>
-  <w:num w:numId="4">
-    <w:abstractNumId w:val="3"/>
+  <w:num w:numId="9" w16cid:durableId="1728261464">
+    <w:abstractNumId w:val="17"/>
   </w:num>
-  <w:num w:numId="5">
-    <w:abstractNumId w:val="11"/>
+  <w:num w:numId="10" w16cid:durableId="920287851">
+    <w:abstractNumId w:val="19"/>
   </w:num>
-  <w:num w:numId="6">
+  <w:num w:numId="11" w16cid:durableId="1298871850">
+    <w:abstractNumId w:val="9"/>
+  </w:num>
+  <w:num w:numId="12" w16cid:durableId="1430740023">
+    <w:abstractNumId w:val="0"/>
+  </w:num>
+  <w:num w:numId="13" w16cid:durableId="1212695263">
+    <w:abstractNumId w:val="8"/>
+  </w:num>
+  <w:num w:numId="14" w16cid:durableId="2134978345">
+    <w:abstractNumId w:val="6"/>
+  </w:num>
+  <w:num w:numId="15" w16cid:durableId="1331908065">
+    <w:abstractNumId w:val="7"/>
+  </w:num>
+  <w:num w:numId="16" w16cid:durableId="1185629965">
+    <w:abstractNumId w:val="14"/>
+  </w:num>
+  <w:num w:numId="17" w16cid:durableId="1773358303">
     <w:abstractNumId w:val="4"/>
   </w:num>
-  <w:num w:numId="7">
-    <w:abstractNumId w:val="1"/>
-  </w:num>
-  <w:num w:numId="8">
-    <w:abstractNumId w:val="9"/>
-  </w:num>
-  <w:num w:numId="9">
+  <w:num w:numId="18" w16cid:durableId="1988851502">
     <w:abstractNumId w:val="12"/>
   </w:num>
-  <w:num w:numId="10">
-    <w:abstractNumId w:val="14"/>
+  <w:num w:numId="19" w16cid:durableId="1912537542">
+    <w:abstractNumId w:val="16"/>
   </w:num>
-  <w:num w:numId="11">
-    <w:abstractNumId w:val="8"/>
-  </w:num>
-  <w:num w:numId="12">
-    <w:abstractNumId w:val="0"/>
-  </w:num>
-  <w:num w:numId="13">
-    <w:abstractNumId w:val="7"/>
-  </w:num>
-  <w:num w:numId="14">
-    <w:abstractNumId w:val="5"/>
-  </w:num>
-  <w:num w:numId="15">
-    <w:abstractNumId w:val="6"/>
+  <w:num w:numId="20" w16cid:durableId="2124882038">
+    <w:abstractNumId w:val="11"/>
   </w:num>
 </w:numbering>
 </file>
 
 <file path=word/people.xml><?xml version="1.0" encoding="utf-8"?>
-<w15:people xmlns:wpc="http://schemas.microsoft.com/office/word/2010/wordprocessingCanvas" xmlns:cx="http://schemas.microsoft.com/office/drawing/2014/chartex" xmlns:cx1="http://schemas.microsoft.com/office/drawing/2015/9/8/chartex" xmlns:mc="http://schemas.openxmlformats.org/markup-compatibility/2006" xmlns:o="urn:schemas-microsoft-com:office:office" xmlns:r="http://schemas.openxmlformats.org/officeDocument/2006/relationships" xmlns:m="http://schemas.openxmlformats.org/officeDocument/2006/math" xmlns:v="urn:schemas-microsoft-com:vml" xmlns:wp14="http://schemas.microsoft.com/office/word/2010/wordprocessingDrawing" xmlns:wp="http://schemas.openxmlformats.org/drawingml/2006/wordprocessingDrawing" xmlns:w10="urn:schemas-microsoft-com:office:word" xmlns:w="http://schemas.openxmlformats.org/wordprocessingml/2006/main" xmlns:w14="http://schemas.microsoft.com/office/word/2010/wordml" xmlns:w15="http://schemas.microsoft.com/office/word/2012/wordml" xmlns:w16se="http://schemas.microsoft.com/office/word/2015/wordml/symex" xmlns:wpg="http://schemas.microsoft.com/office/word/2010/wordprocessingGroup" xmlns:wpi="http://schemas.microsoft.com/office/word/2010/wordprocessingInk" xmlns:wne="http://schemas.microsoft.com/office/word/2006/wordml" xmlns:wps="http://schemas.microsoft.com/office/word/2010/wordprocessingShape" mc:Ignorable="w14 w15 w16se wp14">
+<w15:people xmlns:wpc="http://schemas.microsoft.com/office/word/2010/wordprocessingCanvas" xmlns:cx="http://schemas.microsoft.com/office/drawing/2014/chartex" xmlns:cx1="http://schemas.microsoft.com/office/drawing/2015/9/8/chartex" xmlns:cx2="http://schemas.microsoft.com/office/drawing/2015/10/21/chartex" xmlns:cx3="http://schemas.microsoft.com/office/drawing/2016/5/9/chartex" xmlns:cx4="http://schemas.microsoft.com/office/drawing/2016/5/10/chartex" xmlns:cx5="http://schemas.microsoft.com/office/drawing/2016/5/11/chartex" xmlns:cx6="http://schemas.microsoft.com/office/drawing/2016/5/12/chartex" xmlns:cx7="http://schemas.microsoft.com/office/drawing/2016/5/13/chartex" xmlns:cx8="http://schemas.microsoft.com/office/drawing/2016/5/14/chartex" xmlns:mc="http://schemas.openxmlformats.org/markup-compatibility/2006" xmlns:aink="http://schemas.microsoft.com/office/drawing/2016/ink" xmlns:am3d="http://schemas.microsoft.com/office/drawing/2017/model3d" xmlns:o="urn:schemas-microsoft-com:office:office" xmlns:oel="http://schemas.microsoft.com/office/2019/extlst" xmlns:r="http://schemas.openxmlformats.org/officeDocument/2006/relationships" xmlns:m="http://schemas.openxmlformats.org/officeDocument/2006/math" xmlns:v="urn:schemas-microsoft-com:vml" xmlns:wp14="http://schemas.microsoft.com/office/word/2010/wordprocessingDrawing" xmlns:wp="http://schemas.openxmlformats.org/drawingml/2006/wordprocessingDrawing" xmlns:w10="urn:schemas-microsoft-com:office:word" xmlns:w="http://schemas.openxmlformats.org/wordprocessingml/2006/main" xmlns:w14="http://schemas.microsoft.com/office/word/2010/wordml" xmlns:w15="http://schemas.microsoft.com/office/word/2012/wordml" xmlns:w16cex="http://schemas.microsoft.com/office/word/2018/wordml/cex" xmlns:w16cid="http://schemas.microsoft.com/office/word/2016/wordml/cid" xmlns:w16="http://schemas.microsoft.com/office/word/2018/wordml" xmlns:w16du="http://schemas.microsoft.com/office/word/2023/wordml/word16du" xmlns:w16sdtdh="http://schemas.microsoft.com/office/word/2020/wordml/sdtdatahash" xmlns:w16sdtfl="http://schemas.microsoft.com/office/word/2024/wordml/sdtformatlock" xmlns:w16se="http://schemas.microsoft.com/office/word/2015/wordml/symex" xmlns:wpg="http://schemas.microsoft.com/office/word/2010/wordprocessingGroup" xmlns:wpi="http://schemas.microsoft.com/office/word/2010/wordprocessingInk" xmlns:wne="http://schemas.microsoft.com/office/word/2006/wordml" xmlns:wps="http://schemas.microsoft.com/office/word/2010/wordprocessingShape" mc:Ignorable="w14 w15 w16se w16cid w16 w16cex w16sdtdh w16sdtfl w16du wp14">
   <w15:person w15:author="Aloma Barros">
     <w15:presenceInfo w15:providerId="Windows Live" w15:userId="d639de6b4f83812e"/>
   </w15:person>
@@ -3620,7 +4676,7 @@
 </file>
 
 <file path=word/styles.xml><?xml version="1.0" encoding="utf-8"?>
-<w:styles xmlns:mc="http://schemas.openxmlformats.org/markup-compatibility/2006" xmlns:r="http://schemas.openxmlformats.org/officeDocument/2006/relationships" xmlns:w="http://schemas.openxmlformats.org/wordprocessingml/2006/main" xmlns:w14="http://schemas.microsoft.com/office/word/2010/wordml" xmlns:w15="http://schemas.microsoft.com/office/word/2012/wordml" xmlns:w16se="http://schemas.microsoft.com/office/word/2015/wordml/symex" mc:Ignorable="w14 w15 w16se">
+<w:styles xmlns:mc="http://schemas.openxmlformats.org/markup-compatibility/2006" xmlns:r="http://schemas.openxmlformats.org/officeDocument/2006/relationships" xmlns:w="http://schemas.openxmlformats.org/wordprocessingml/2006/main" xmlns:w14="http://schemas.microsoft.com/office/word/2010/wordml" xmlns:w15="http://schemas.microsoft.com/office/word/2012/wordml" xmlns:w16cex="http://schemas.microsoft.com/office/word/2018/wordml/cex" xmlns:w16cid="http://schemas.microsoft.com/office/word/2016/wordml/cid" xmlns:w16="http://schemas.microsoft.com/office/word/2018/wordml" xmlns:w16du="http://schemas.microsoft.com/office/word/2023/wordml/word16du" xmlns:w16sdtdh="http://schemas.microsoft.com/office/word/2020/wordml/sdtdatahash" xmlns:w16sdtfl="http://schemas.microsoft.com/office/word/2024/wordml/sdtformatlock" xmlns:w16se="http://schemas.microsoft.com/office/word/2015/wordml/symex" mc:Ignorable="w14 w15 w16se w16cid w16 w16cex w16sdtdh w16sdtfl w16du">
   <w:docDefaults>
     <w:rPrDefault>
       <w:rPr>
@@ -3638,7 +4694,7 @@
       </w:pPr>
     </w:pPrDefault>
   </w:docDefaults>
-  <w:latentStyles w:defLockedState="0" w:defUIPriority="99" w:defSemiHidden="0" w:defUnhideWhenUsed="0" w:defQFormat="0" w:count="371">
+  <w:latentStyles w:defLockedState="0" w:defUIPriority="99" w:defSemiHidden="0" w:defUnhideWhenUsed="0" w:defQFormat="0" w:count="376">
     <w:lsdException w:name="Normal" w:uiPriority="0" w:qFormat="1"/>
     <w:lsdException w:name="heading 1" w:uiPriority="9" w:qFormat="1"/>
     <w:lsdException w:name="heading 2" w:semiHidden="1" w:uiPriority="9" w:unhideWhenUsed="1" w:qFormat="1"/>
@@ -4010,6 +5066,11 @@
     <w:lsdException w:name="List Table 5 Dark Accent 6" w:uiPriority="50"/>
     <w:lsdException w:name="List Table 6 Colorful Accent 6" w:uiPriority="51"/>
     <w:lsdException w:name="List Table 7 Colorful Accent 6" w:uiPriority="52"/>
+    <w:lsdException w:name="Mention" w:semiHidden="1" w:unhideWhenUsed="1"/>
+    <w:lsdException w:name="Smart Hyperlink" w:semiHidden="1" w:unhideWhenUsed="1"/>
+    <w:lsdException w:name="Hashtag" w:semiHidden="1" w:unhideWhenUsed="1"/>
+    <w:lsdException w:name="Unresolved Mention" w:semiHidden="1" w:unhideWhenUsed="1"/>
+    <w:lsdException w:name="Smart Link" w:semiHidden="1" w:unhideWhenUsed="1"/>
   </w:latentStyles>
   <w:style w:type="paragraph" w:default="1" w:styleId="Normal">
     <w:name w:val="Normal"/>
@@ -4224,7 +5285,6 @@
   <w:style w:type="character" w:default="1" w:styleId="Fontepargpadro">
     <w:name w:val="Default Paragraph Font"/>
     <w:uiPriority w:val="1"/>
-    <w:semiHidden/>
     <w:unhideWhenUsed/>
   </w:style>
   <w:style w:type="table" w:default="1" w:styleId="Tabelanormal">

</xml_diff>